<commit_message>
Fix: fix bugs, add new shared tests in wiki and update diagrams
</commit_message>
<xml_diff>
--- a/docs/RetrospectivaC2.docx
+++ b/docs/RetrospectivaC2.docx
@@ -1,6 +1,6 @@
 
 <file path=word/document.xml><?xml version="1.0" encoding="utf-8"?>
-<w:document xmlns:wpc="http://schemas.microsoft.com/office/word/2010/wordprocessingCanvas" xmlns:cx="http://schemas.microsoft.com/office/drawing/2014/chartex" xmlns:cx1="http://schemas.microsoft.com/office/drawing/2015/9/8/chartex" xmlns:cx2="http://schemas.microsoft.com/office/drawing/2015/10/21/chartex" xmlns:cx3="http://schemas.microsoft.com/office/drawing/2016/5/9/chartex" xmlns:cx4="http://schemas.microsoft.com/office/drawing/2016/5/10/chartex" xmlns:cx5="http://schemas.microsoft.com/office/drawing/2016/5/11/chartex" xmlns:cx6="http://schemas.microsoft.com/office/drawing/2016/5/12/chartex" xmlns:cx7="http://schemas.microsoft.com/office/drawing/2016/5/13/chartex" xmlns:cx8="http://schemas.microsoft.com/office/drawing/2016/5/14/chartex" xmlns:mc="http://schemas.openxmlformats.org/markup-compatibility/2006" xmlns:aink="http://schemas.microsoft.com/office/drawing/2016/ink" xmlns:am3d="http://schemas.microsoft.com/office/drawing/2017/model3d" xmlns:o="urn:schemas-microsoft-com:office:office" xmlns:r="http://schemas.openxmlformats.org/officeDocument/2006/relationships" xmlns:m="http://schemas.openxmlformats.org/officeDocument/2006/math" xmlns:v="urn:schemas-microsoft-com:vml" xmlns:wp14="http://schemas.microsoft.com/office/word/2010/wordprocessingDrawing" xmlns:wp="http://schemas.openxmlformats.org/drawingml/2006/wordprocessingDrawing" xmlns:w10="urn:schemas-microsoft-com:office:word" xmlns:w="http://schemas.openxmlformats.org/wordprocessingml/2006/main" xmlns:w14="http://schemas.microsoft.com/office/word/2010/wordml" xmlns:w15="http://schemas.microsoft.com/office/word/2012/wordml" xmlns:w16cex="http://schemas.microsoft.com/office/word/2018/wordml/cex" xmlns:w16cid="http://schemas.microsoft.com/office/word/2016/wordml/cid" xmlns:w16="http://schemas.microsoft.com/office/word/2018/wordml" xmlns:w16sdtdh="http://schemas.microsoft.com/office/word/2020/wordml/sdtdatahash" xmlns:w16se="http://schemas.microsoft.com/office/word/2015/wordml/symex" xmlns:wpg="http://schemas.microsoft.com/office/word/2010/wordprocessingGroup" xmlns:wpi="http://schemas.microsoft.com/office/word/2010/wordprocessingInk" xmlns:wne="http://schemas.microsoft.com/office/word/2006/wordml" xmlns:wps="http://schemas.microsoft.com/office/word/2010/wordprocessingShape" mc:Ignorable="w14 w15 w16se w16cid w16 w16cex w16sdtdh wp14">
+<w:document xmlns:wpc="http://schemas.microsoft.com/office/word/2010/wordprocessingCanvas" xmlns:cx="http://schemas.microsoft.com/office/drawing/2014/chartex" xmlns:cx1="http://schemas.microsoft.com/office/drawing/2015/9/8/chartex" xmlns:cx2="http://schemas.microsoft.com/office/drawing/2015/10/21/chartex" xmlns:cx3="http://schemas.microsoft.com/office/drawing/2016/5/9/chartex" xmlns:cx4="http://schemas.microsoft.com/office/drawing/2016/5/10/chartex" xmlns:cx5="http://schemas.microsoft.com/office/drawing/2016/5/11/chartex" xmlns:cx6="http://schemas.microsoft.com/office/drawing/2016/5/12/chartex" xmlns:cx7="http://schemas.microsoft.com/office/drawing/2016/5/13/chartex" xmlns:cx8="http://schemas.microsoft.com/office/drawing/2016/5/14/chartex" xmlns:mc="http://schemas.openxmlformats.org/markup-compatibility/2006" xmlns:aink="http://schemas.microsoft.com/office/drawing/2016/ink" xmlns:am3d="http://schemas.microsoft.com/office/drawing/2017/model3d" xmlns:o="urn:schemas-microsoft-com:office:office" xmlns:oel="http://schemas.microsoft.com/office/2019/extlst" xmlns:r="http://schemas.openxmlformats.org/officeDocument/2006/relationships" xmlns:m="http://schemas.openxmlformats.org/officeDocument/2006/math" xmlns:v="urn:schemas-microsoft-com:vml" xmlns:wp14="http://schemas.microsoft.com/office/word/2010/wordprocessingDrawing" xmlns:wp="http://schemas.openxmlformats.org/drawingml/2006/wordprocessingDrawing" xmlns:w10="urn:schemas-microsoft-com:office:word" xmlns:w="http://schemas.openxmlformats.org/wordprocessingml/2006/main" xmlns:w14="http://schemas.microsoft.com/office/word/2010/wordml" xmlns:w15="http://schemas.microsoft.com/office/word/2012/wordml" xmlns:w16cex="http://schemas.microsoft.com/office/word/2018/wordml/cex" xmlns:w16cid="http://schemas.microsoft.com/office/word/2016/wordml/cid" xmlns:w16="http://schemas.microsoft.com/office/word/2018/wordml" xmlns:w16du="http://schemas.microsoft.com/office/word/2023/wordml/word16du" xmlns:w16sdtdh="http://schemas.microsoft.com/office/word/2020/wordml/sdtdatahash" xmlns:w16sdtfl="http://schemas.microsoft.com/office/word/2024/wordml/sdtformatlock" xmlns:w16se="http://schemas.microsoft.com/office/word/2015/wordml/symex" xmlns:wpg="http://schemas.microsoft.com/office/word/2010/wordprocessingGroup" xmlns:wpi="http://schemas.microsoft.com/office/word/2010/wordprocessingInk" xmlns:wne="http://schemas.microsoft.com/office/word/2006/wordml" xmlns:wps="http://schemas.microsoft.com/office/word/2010/wordprocessingShape" mc:Ignorable="w14 w15 w16se w16cid w16 w16cex w16sdtdh w16sdtfl w16du wp14">
   <w:body>
     <w:p>
       <w:pPr>
@@ -94,8 +94,20 @@
           <w:sz w:val="28"/>
           <w:szCs w:val="28"/>
         </w:rPr>
-        <w:t xml:space="preserve"> SlotMachine</w:t>
-      </w:r>
+        <w:t xml:space="preserve"> </w:t>
+      </w:r>
+      <w:proofErr w:type="spellStart"/>
+      <w:r>
+        <w:rPr>
+          <w:rFonts w:ascii="Arial" w:hAnsi="Arial" w:cs="Arial"/>
+          <w:b/>
+          <w:bCs/>
+          <w:sz w:val="28"/>
+          <w:szCs w:val="28"/>
+        </w:rPr>
+        <w:t>SlotMachine</w:t>
+      </w:r>
+      <w:proofErr w:type="spellEnd"/>
     </w:p>
     <w:p>
       <w:pPr>
@@ -112,7 +124,21 @@
         <w:rPr>
           <w:rFonts w:ascii="Arial" w:hAnsi="Arial" w:cs="Arial"/>
         </w:rPr>
-        <w:t xml:space="preserve">¿Cuáles fueron los mini-ciclos definidos? Justifíquenlos. </w:t>
+        <w:t xml:space="preserve">¿Cuáles fueron los </w:t>
+      </w:r>
+      <w:proofErr w:type="spellStart"/>
+      <w:r>
+        <w:rPr>
+          <w:rFonts w:ascii="Arial" w:hAnsi="Arial" w:cs="Arial"/>
+        </w:rPr>
+        <w:t>mini-ciclos</w:t>
+      </w:r>
+      <w:proofErr w:type="spellEnd"/>
+      <w:r>
+        <w:rPr>
+          <w:rFonts w:ascii="Arial" w:hAnsi="Arial" w:cs="Arial"/>
+        </w:rPr>
+        <w:t xml:space="preserve"> definidos? Justifíquenlos. </w:t>
       </w:r>
     </w:p>
     <w:p>
@@ -165,24 +191,18 @@
           <w:color w:val="0070C0"/>
           <w:lang w:val="en-US"/>
         </w:rPr>
-        <w:t>lock(</w:t>
-      </w:r>
-      <w:r>
+        <w:t>lock(int wheel), unlock(int wheel)</w:t>
+      </w:r>
+    </w:p>
+    <w:p>
+      <w:pPr>
+        <w:pStyle w:val="Prrafodelista"/>
         <w:rPr>
           <w:rFonts w:ascii="Arial" w:hAnsi="Arial" w:cs="Arial"/>
           <w:color w:val="0070C0"/>
           <w:lang w:val="en-US"/>
         </w:rPr>
-        <w:t xml:space="preserve">int </w:t>
-      </w:r>
-      <w:r>
-        <w:rPr>
-          <w:rFonts w:ascii="Arial" w:hAnsi="Arial" w:cs="Arial"/>
-          <w:color w:val="0070C0"/>
-          <w:lang w:val="en-US"/>
-        </w:rPr>
-        <w:t>wheel), unlock(int wheel)</w:t>
-      </w:r>
+      </w:pPr>
     </w:p>
     <w:p>
       <w:pPr>
@@ -190,17 +210,6 @@
         <w:rPr>
           <w:rFonts w:ascii="Arial" w:hAnsi="Arial" w:cs="Arial"/>
           <w:color w:val="0070C0"/>
-          <w:lang w:val="en-US"/>
-        </w:rPr>
-      </w:pPr>
-    </w:p>
-    <w:p>
-      <w:pPr>
-        <w:pStyle w:val="Prrafodelista"/>
-        <w:rPr>
-          <w:rFonts w:ascii="Arial" w:hAnsi="Arial" w:cs="Arial"/>
-          <w:color w:val="0070C0"/>
-          <w:lang w:val="en-US"/>
         </w:rPr>
       </w:pPr>
       <w:r>
@@ -241,9 +250,40 @@
         <w:rPr>
           <w:rFonts w:ascii="Arial" w:hAnsi="Arial" w:cs="Arial"/>
           <w:color w:val="0070C0"/>
-          <w:lang w:val="en-US"/>
-        </w:rPr>
-        <w:t>Antes de poder intercambiar dos ruedas o hacerlas girar con las nuevas funcionalidades de este ciclo, se requiere de un mecanismo que permita restringir dicha interacción sobre ruedas específicas. Este mini-ciclo depende de las ruedas ya creadas en el Ciclo 1, y es independiente de intercambiar o girar, ya que solo se encarga de marcar y desmarcar el estado de bloqueo; los demás mini-ciclos de este ciclo dependen de este para validar si una operación puede ejecutarse.</w:t>
+        </w:rPr>
+        <w:t xml:space="preserve">Antes de poder intercambiar dos ruedas o hacerlas girar con las nuevas funcionalidades de este ciclo, se requiere de un mecanismo que permita restringir dicha interacción sobre ruedas específicas. Este </w:t>
+      </w:r>
+      <w:proofErr w:type="spellStart"/>
+      <w:r>
+        <w:rPr>
+          <w:rFonts w:ascii="Arial" w:hAnsi="Arial" w:cs="Arial"/>
+          <w:color w:val="0070C0"/>
+        </w:rPr>
+        <w:t>mini-ciclo</w:t>
+      </w:r>
+      <w:proofErr w:type="spellEnd"/>
+      <w:r>
+        <w:rPr>
+          <w:rFonts w:ascii="Arial" w:hAnsi="Arial" w:cs="Arial"/>
+          <w:color w:val="0070C0"/>
+        </w:rPr>
+        <w:t xml:space="preserve"> depende de las ruedas ya creadas en el Ciclo 1, y es independiente de intercambiar o girar, ya que solo se encarga de marcar y desmarcar el estado de bloqueo; los demás </w:t>
+      </w:r>
+      <w:proofErr w:type="spellStart"/>
+      <w:r>
+        <w:rPr>
+          <w:rFonts w:ascii="Arial" w:hAnsi="Arial" w:cs="Arial"/>
+          <w:color w:val="0070C0"/>
+        </w:rPr>
+        <w:t>mini-ciclos</w:t>
+      </w:r>
+      <w:proofErr w:type="spellEnd"/>
+      <w:r>
+        <w:rPr>
+          <w:rFonts w:ascii="Arial" w:hAnsi="Arial" w:cs="Arial"/>
+          <w:color w:val="0070C0"/>
+        </w:rPr>
+        <w:t xml:space="preserve"> de este ciclo dependen de este para validar si una operación puede ejecutarse.</w:t>
       </w:r>
     </w:p>
     <w:p>
@@ -303,54 +343,22 @@
           <w:color w:val="0070C0"/>
           <w:lang w:val="en-US"/>
         </w:rPr>
-        <w:t>swap(</w:t>
-      </w:r>
+        <w:t>swap(int wheel1, int wheel2)</w:t>
+      </w:r>
+    </w:p>
+    <w:p>
+      <w:pPr>
+        <w:rPr>
+          <w:rFonts w:ascii="Arial" w:hAnsi="Arial" w:cs="Arial"/>
+          <w:color w:val="0070C0"/>
+        </w:rPr>
+      </w:pPr>
       <w:r>
         <w:rPr>
           <w:rFonts w:ascii="Arial" w:hAnsi="Arial" w:cs="Arial"/>
           <w:color w:val="0070C0"/>
           <w:lang w:val="en-US"/>
         </w:rPr>
-        <w:t xml:space="preserve">int </w:t>
-      </w:r>
-      <w:r>
-        <w:rPr>
-          <w:rFonts w:ascii="Arial" w:hAnsi="Arial" w:cs="Arial"/>
-          <w:color w:val="0070C0"/>
-          <w:lang w:val="en-US"/>
-        </w:rPr>
-        <w:t xml:space="preserve">wheel1, </w:t>
-      </w:r>
-      <w:r>
-        <w:rPr>
-          <w:rFonts w:ascii="Arial" w:hAnsi="Arial" w:cs="Arial"/>
-          <w:color w:val="0070C0"/>
-          <w:lang w:val="en-US"/>
-        </w:rPr>
-        <w:t xml:space="preserve">int </w:t>
-      </w:r>
-      <w:r>
-        <w:rPr>
-          <w:rFonts w:ascii="Arial" w:hAnsi="Arial" w:cs="Arial"/>
-          <w:color w:val="0070C0"/>
-          <w:lang w:val="en-US"/>
-        </w:rPr>
-        <w:t>wheel2)</w:t>
-      </w:r>
-    </w:p>
-    <w:p>
-      <w:pPr>
-        <w:rPr>
-          <w:rFonts w:ascii="Arial" w:hAnsi="Arial" w:cs="Arial"/>
-          <w:color w:val="0070C0"/>
-        </w:rPr>
-      </w:pPr>
-      <w:r>
-        <w:rPr>
-          <w:rFonts w:ascii="Arial" w:hAnsi="Arial" w:cs="Arial"/>
-          <w:color w:val="0070C0"/>
-          <w:lang w:val="en-US"/>
-        </w:rPr>
         <w:tab/>
       </w:r>
       <w:r>
@@ -382,12 +390,6 @@
           <w:color w:val="0070C0"/>
         </w:rPr>
         <w:tab/>
-      </w:r>
-      <w:r>
-        <w:rPr>
-          <w:rFonts w:ascii="Arial" w:hAnsi="Arial" w:cs="Arial"/>
-          <w:color w:val="0070C0"/>
-        </w:rPr>
         <w:t xml:space="preserve">de intercambiar la posición de dos ruedas se requiere validar que ninguna </w:t>
       </w:r>
       <w:r>
@@ -494,7 +496,7 @@
           <w:color w:val="0070C0"/>
           <w:lang w:val="en-US"/>
         </w:rPr>
-        <w:t xml:space="preserve">spin(int wheel, int steps), </w:t>
+        <w:t>spin(int wheel, int steps), spin(</w:t>
       </w:r>
       <w:r>
         <w:rPr>
@@ -504,8 +506,9 @@
           <w:color w:val="0070C0"/>
           <w:lang w:val="en-US"/>
         </w:rPr>
-        <w:t>spin(</w:t>
-      </w:r>
+        <w:t xml:space="preserve">string[] </w:t>
+      </w:r>
+      <w:proofErr w:type="spellStart"/>
       <w:r>
         <w:rPr>
           <w:rFonts w:ascii="Arial" w:hAnsi="Arial" w:cs="Arial"/>
@@ -514,7 +517,18 @@
           <w:color w:val="0070C0"/>
           <w:lang w:val="en-US"/>
         </w:rPr>
-        <w:t>string[] setSymbols)</w:t>
+        <w:t>setSymbols</w:t>
+      </w:r>
+      <w:proofErr w:type="spellEnd"/>
+      <w:r>
+        <w:rPr>
+          <w:rFonts w:ascii="Arial" w:hAnsi="Arial" w:cs="Arial"/>
+          <w:b/>
+          <w:bCs/>
+          <w:color w:val="0070C0"/>
+          <w:lang w:val="en-US"/>
+        </w:rPr>
+        <w:t>)</w:t>
       </w:r>
     </w:p>
     <w:p>
@@ -539,7 +553,87 @@
           <w:rFonts w:ascii="Arial" w:hAnsi="Arial" w:cs="Arial"/>
           <w:color w:val="0070C0"/>
         </w:rPr>
-        <w:t>Amplía la funcionalidad básica de giro definida en el Ciclo 1, dando más control sobre el resultado de una tirada: spin(int wheel, int steps) permite avanzar una rueda específica una cantidad determinada de posiciones, y spin(String[] setSymbols) permite fijar de una sola vez la configuración completa del tablero. Depende del MIN</w:t>
+        <w:t>Amplía la funcionalidad básica de giro definida en el Ciclo 1, dando más control sobre el resultado de una tirada: spin(</w:t>
+      </w:r>
+      <w:proofErr w:type="spellStart"/>
+      <w:r>
+        <w:rPr>
+          <w:rFonts w:ascii="Arial" w:hAnsi="Arial" w:cs="Arial"/>
+          <w:color w:val="0070C0"/>
+        </w:rPr>
+        <w:t>int</w:t>
+      </w:r>
+      <w:proofErr w:type="spellEnd"/>
+      <w:r>
+        <w:rPr>
+          <w:rFonts w:ascii="Arial" w:hAnsi="Arial" w:cs="Arial"/>
+          <w:color w:val="0070C0"/>
+        </w:rPr>
+        <w:t xml:space="preserve"> </w:t>
+      </w:r>
+      <w:proofErr w:type="spellStart"/>
+      <w:r>
+        <w:rPr>
+          <w:rFonts w:ascii="Arial" w:hAnsi="Arial" w:cs="Arial"/>
+          <w:color w:val="0070C0"/>
+        </w:rPr>
+        <w:t>wheel</w:t>
+      </w:r>
+      <w:proofErr w:type="spellEnd"/>
+      <w:r>
+        <w:rPr>
+          <w:rFonts w:ascii="Arial" w:hAnsi="Arial" w:cs="Arial"/>
+          <w:color w:val="0070C0"/>
+        </w:rPr>
+        <w:t xml:space="preserve">, </w:t>
+      </w:r>
+      <w:proofErr w:type="spellStart"/>
+      <w:r>
+        <w:rPr>
+          <w:rFonts w:ascii="Arial" w:hAnsi="Arial" w:cs="Arial"/>
+          <w:color w:val="0070C0"/>
+        </w:rPr>
+        <w:t>int</w:t>
+      </w:r>
+      <w:proofErr w:type="spellEnd"/>
+      <w:r>
+        <w:rPr>
+          <w:rFonts w:ascii="Arial" w:hAnsi="Arial" w:cs="Arial"/>
+          <w:color w:val="0070C0"/>
+        </w:rPr>
+        <w:t xml:space="preserve"> </w:t>
+      </w:r>
+      <w:proofErr w:type="spellStart"/>
+      <w:r>
+        <w:rPr>
+          <w:rFonts w:ascii="Arial" w:hAnsi="Arial" w:cs="Arial"/>
+          <w:color w:val="0070C0"/>
+        </w:rPr>
+        <w:t>steps</w:t>
+      </w:r>
+      <w:proofErr w:type="spellEnd"/>
+      <w:r>
+        <w:rPr>
+          <w:rFonts w:ascii="Arial" w:hAnsi="Arial" w:cs="Arial"/>
+          <w:color w:val="0070C0"/>
+        </w:rPr>
+        <w:t xml:space="preserve">) permite avanzar una rueda específica una cantidad determinada de posiciones, y spin(String[] </w:t>
+      </w:r>
+      <w:proofErr w:type="spellStart"/>
+      <w:r>
+        <w:rPr>
+          <w:rFonts w:ascii="Arial" w:hAnsi="Arial" w:cs="Arial"/>
+          <w:color w:val="0070C0"/>
+        </w:rPr>
+        <w:t>setSymbols</w:t>
+      </w:r>
+      <w:proofErr w:type="spellEnd"/>
+      <w:r>
+        <w:rPr>
+          <w:rFonts w:ascii="Arial" w:hAnsi="Arial" w:cs="Arial"/>
+          <w:color w:val="0070C0"/>
+        </w:rPr>
+        <w:t>) permite fijar de una sola vez la configuración completa del tablero. Depende del MIN</w:t>
       </w:r>
       <w:r>
         <w:rPr>
@@ -553,7 +647,55 @@
           <w:rFonts w:ascii="Arial" w:hAnsi="Arial" w:cs="Arial"/>
           <w:color w:val="0070C0"/>
         </w:rPr>
-        <w:t>-CICLO 1 para validar el bloqueo antes de operar, y del Ciclo 1 para el giro básico y la verificación de jackpot, ya que al finalizar ambos métodos comprueban si el resultado constituye un jackpot mediante winnerAppearance().</w:t>
+        <w:t xml:space="preserve">-CICLO 1 para validar el bloqueo antes de operar, y del Ciclo 1 para el giro básico y la verificación de </w:t>
+      </w:r>
+      <w:proofErr w:type="spellStart"/>
+      <w:r>
+        <w:rPr>
+          <w:rFonts w:ascii="Arial" w:hAnsi="Arial" w:cs="Arial"/>
+          <w:color w:val="0070C0"/>
+        </w:rPr>
+        <w:t>jackpot</w:t>
+      </w:r>
+      <w:proofErr w:type="spellEnd"/>
+      <w:r>
+        <w:rPr>
+          <w:rFonts w:ascii="Arial" w:hAnsi="Arial" w:cs="Arial"/>
+          <w:color w:val="0070C0"/>
+        </w:rPr>
+        <w:t xml:space="preserve">, ya que al finalizar ambos métodos comprueban si el resultado constituye un </w:t>
+      </w:r>
+      <w:proofErr w:type="spellStart"/>
+      <w:r>
+        <w:rPr>
+          <w:rFonts w:ascii="Arial" w:hAnsi="Arial" w:cs="Arial"/>
+          <w:color w:val="0070C0"/>
+        </w:rPr>
+        <w:t>jackpot</w:t>
+      </w:r>
+      <w:proofErr w:type="spellEnd"/>
+      <w:r>
+        <w:rPr>
+          <w:rFonts w:ascii="Arial" w:hAnsi="Arial" w:cs="Arial"/>
+          <w:color w:val="0070C0"/>
+        </w:rPr>
+        <w:t xml:space="preserve"> mediante </w:t>
+      </w:r>
+      <w:proofErr w:type="spellStart"/>
+      <w:r>
+        <w:rPr>
+          <w:rFonts w:ascii="Arial" w:hAnsi="Arial" w:cs="Arial"/>
+          <w:color w:val="0070C0"/>
+        </w:rPr>
+        <w:t>winnerAppearance</w:t>
+      </w:r>
+      <w:proofErr w:type="spellEnd"/>
+      <w:r>
+        <w:rPr>
+          <w:rFonts w:ascii="Arial" w:hAnsi="Arial" w:cs="Arial"/>
+          <w:color w:val="0070C0"/>
+        </w:rPr>
+        <w:t>().</w:t>
       </w:r>
     </w:p>
     <w:p>
@@ -608,7 +750,21 @@
           <w:rFonts w:ascii="Arial" w:hAnsi="Arial" w:cs="Arial"/>
         </w:rPr>
         <w:lastRenderedPageBreak/>
-        <w:t>¿Cuál es el estado actual del proyecto en términos de mini-ciclos? ¿por qué?</w:t>
+        <w:t xml:space="preserve">¿Cuál es el estado actual del proyecto en términos de </w:t>
+      </w:r>
+      <w:proofErr w:type="spellStart"/>
+      <w:r>
+        <w:rPr>
+          <w:rFonts w:ascii="Arial" w:hAnsi="Arial" w:cs="Arial"/>
+        </w:rPr>
+        <w:t>mini-ciclos</w:t>
+      </w:r>
+      <w:proofErr w:type="spellEnd"/>
+      <w:r>
+        <w:rPr>
+          <w:rFonts w:ascii="Arial" w:hAnsi="Arial" w:cs="Arial"/>
+        </w:rPr>
+        <w:t>? ¿por qué?</w:t>
       </w:r>
     </w:p>
     <w:p>
@@ -640,7 +796,39 @@
           <w:rFonts w:ascii="Arial" w:hAnsi="Arial" w:cs="Arial"/>
           <w:color w:val="0070C0"/>
         </w:rPr>
-        <w:t>---</w:t>
+        <w:t xml:space="preserve">El proyecto esta totalmente terminado incluyendo los </w:t>
+      </w:r>
+      <w:proofErr w:type="spellStart"/>
+      <w:r>
+        <w:rPr>
+          <w:rFonts w:ascii="Arial" w:hAnsi="Arial" w:cs="Arial"/>
+          <w:color w:val="0070C0"/>
+        </w:rPr>
+        <w:t>tests</w:t>
+      </w:r>
+      <w:proofErr w:type="spellEnd"/>
+      <w:r>
+        <w:rPr>
+          <w:rFonts w:ascii="Arial" w:hAnsi="Arial" w:cs="Arial"/>
+          <w:color w:val="0070C0"/>
+        </w:rPr>
+        <w:t xml:space="preserve"> de todo el grupo dentro de la wiki, este proyecto tiene sus dos ciclos completamente implementados y listos para presentar, esto porque tuvimos un compromiso revisión y trabajo colaborativo lo mejor que se </w:t>
+      </w:r>
+      <w:proofErr w:type="spellStart"/>
+      <w:r>
+        <w:rPr>
+          <w:rFonts w:ascii="Arial" w:hAnsi="Arial" w:cs="Arial"/>
+          <w:color w:val="0070C0"/>
+        </w:rPr>
+        <w:t>logro</w:t>
+      </w:r>
+      <w:proofErr w:type="spellEnd"/>
+      <w:r>
+        <w:rPr>
+          <w:rFonts w:ascii="Arial" w:hAnsi="Arial" w:cs="Arial"/>
+          <w:color w:val="0070C0"/>
+        </w:rPr>
+        <w:t>.</w:t>
       </w:r>
     </w:p>
     <w:p>
@@ -687,7 +875,7 @@
           <w:bCs/>
           <w:color w:val="0070C0"/>
         </w:rPr>
-        <w:t>#</w:t>
+        <w:t>20</w:t>
       </w:r>
       <w:r>
         <w:rPr>
@@ -725,7 +913,7 @@
           <w:bCs/>
           <w:color w:val="0070C0"/>
         </w:rPr>
-        <w:t>#</w:t>
+        <w:t>20</w:t>
       </w:r>
       <w:r>
         <w:rPr>
@@ -787,14 +975,17 @@
           <w:bCs/>
           <w:color w:val="0070C0"/>
         </w:rPr>
-        <w:t xml:space="preserve">: </w:t>
-      </w:r>
-      <w:r>
-        <w:rPr>
-          <w:rFonts w:ascii="Arial" w:hAnsi="Arial" w:cs="Arial"/>
-          <w:color w:val="0070C0"/>
-        </w:rPr>
-        <w:t>---</w:t>
+        <w:t>:</w:t>
+      </w:r>
+      <w:r>
+        <w:t xml:space="preserve"> </w:t>
+      </w:r>
+      <w:r>
+        <w:rPr>
+          <w:rFonts w:ascii="Arial" w:hAnsi="Arial" w:cs="Arial"/>
+          <w:color w:val="0070C0"/>
+        </w:rPr>
+        <w:t>El mayor logro del equipo fue lograr la implementación exitosa de los nuevos requerimientos sin necesidad de modificar drásticamente el código previamente escrito. Esto demostró que el diseño inicial del Ciclo 1 fue altamente escalable, desacoplado y estructurado bajo buenas prácticas, permitiendo extender la funcionalidad del sistema (como bloqueos, giros específicos e intercambios) mediante la adición de nuevos métodos sin romper la arquitectura existente.</w:t>
       </w:r>
     </w:p>
     <w:p>
@@ -854,7 +1045,57 @@
           <w:rFonts w:ascii="Arial" w:hAnsi="Arial" w:cs="Arial"/>
           <w:color w:val="0070C0"/>
         </w:rPr>
-        <w:t>---</w:t>
+        <w:t xml:space="preserve">El mayor problema técnico radicó en </w:t>
+      </w:r>
+      <w:r>
+        <w:rPr>
+          <w:rFonts w:ascii="Arial" w:hAnsi="Arial" w:cs="Arial"/>
+          <w:b/>
+          <w:bCs/>
+          <w:color w:val="0070C0"/>
+        </w:rPr>
+        <w:t>adaptar nuestra solución a las pruebas automatizadas de otros equipos</w:t>
+      </w:r>
+      <w:r>
+        <w:rPr>
+          <w:rFonts w:ascii="Arial" w:hAnsi="Arial" w:cs="Arial"/>
+          <w:color w:val="0070C0"/>
+        </w:rPr>
+        <w:t>, particularmente en el manejo del comportamiento visual de la interfaz. Inicialmente, nuestro diseño asumía que la máquina de ranuras (</w:t>
+      </w:r>
+      <w:proofErr w:type="spellStart"/>
+      <w:r>
+        <w:rPr>
+          <w:rFonts w:ascii="Arial" w:hAnsi="Arial" w:cs="Arial"/>
+          <w:i/>
+          <w:iCs/>
+          <w:color w:val="0070C0"/>
+        </w:rPr>
+        <w:t>SlotMachine</w:t>
+      </w:r>
+      <w:proofErr w:type="spellEnd"/>
+      <w:r>
+        <w:rPr>
+          <w:rFonts w:ascii="Arial" w:hAnsi="Arial" w:cs="Arial"/>
+          <w:color w:val="0070C0"/>
+        </w:rPr>
+        <w:t xml:space="preserve">) se visibilizaba automáticamente por defecto al crearse. Sin embargo, para hacer compatibles los </w:t>
+      </w:r>
+      <w:proofErr w:type="spellStart"/>
+      <w:r>
+        <w:rPr>
+          <w:rFonts w:ascii="Arial" w:hAnsi="Arial" w:cs="Arial"/>
+          <w:color w:val="0070C0"/>
+        </w:rPr>
+        <w:t>tests</w:t>
+      </w:r>
+      <w:proofErr w:type="spellEnd"/>
+      <w:r>
+        <w:rPr>
+          <w:rFonts w:ascii="Arial" w:hAnsi="Arial" w:cs="Arial"/>
+          <w:color w:val="0070C0"/>
+        </w:rPr>
+        <w:t xml:space="preserve"> invisibles, tuvimos que reestructurar la lógica introduciendo un atributo explícito Visible. Modificamos el constructor para que no hiciera la interfaz visible por defecto y agregamos validaciones internas que comprueban si la máquina es visible antes de ejecutar cualquier animación o renderizado gráfico.</w:t>
       </w:r>
     </w:p>
     <w:p>
@@ -889,6 +1130,8 @@
         <w:pStyle w:val="Prrafodelista"/>
         <w:rPr>
           <w:rFonts w:ascii="Arial" w:hAnsi="Arial" w:cs="Arial"/>
+          <w:b/>
+          <w:bCs/>
           <w:color w:val="0070C0"/>
         </w:rPr>
       </w:pPr>
@@ -911,12 +1154,54 @@
       <w:r>
         <w:rPr>
           <w:rFonts w:ascii="Arial" w:hAnsi="Arial" w:cs="Arial"/>
-          <w:b/>
-          <w:bCs/>
-          <w:color w:val="0070C0"/>
-        </w:rPr>
-        <w:t>---</w:t>
-      </w:r>
+          <w:color w:val="0070C0"/>
+        </w:rPr>
+        <w:t xml:space="preserve">Lo que hicimos bien: Resalta el apoyo mutuo y la solidaridad colaborativa. Enfrentamos una semana compleja con carga de parciales y situaciones de salud en ambos lados; a pesar de esto, logramos distribuir el trabajo de forma equitativa, apoyarnos en los momentos de </w:t>
+      </w:r>
+      <w:r>
+        <w:rPr>
+          <w:rFonts w:ascii="Arial" w:hAnsi="Arial" w:cs="Arial"/>
+          <w:color w:val="0070C0"/>
+        </w:rPr>
+        <w:t>dificultades</w:t>
+      </w:r>
+      <w:r>
+        <w:rPr>
+          <w:rFonts w:ascii="Arial" w:hAnsi="Arial" w:cs="Arial"/>
+          <w:color w:val="0070C0"/>
+        </w:rPr>
+        <w:t xml:space="preserve"> y sacar adelante la entrega.</w:t>
+      </w:r>
+    </w:p>
+    <w:p>
+      <w:pPr>
+        <w:pStyle w:val="Prrafodelista"/>
+        <w:numPr>
+          <w:ilvl w:val="0"/>
+          <w:numId w:val="4"/>
+        </w:numPr>
+        <w:rPr>
+          <w:rFonts w:ascii="Arial" w:hAnsi="Arial" w:cs="Arial"/>
+          <w:color w:val="0070C0"/>
+        </w:rPr>
+      </w:pPr>
+      <w:r>
+        <w:rPr>
+          <w:rFonts w:ascii="Arial" w:hAnsi="Arial" w:cs="Arial"/>
+          <w:color w:val="0070C0"/>
+        </w:rPr>
+        <w:lastRenderedPageBreak/>
+        <w:t>Nos comprometemos a planificar mejor las estimaciones de tiempo, definir hitos intermedios más rigurosos y cumplir estrictamente con los tiempos proyectados para evitar acumulaciones de trabajo en la fase final.</w:t>
+      </w:r>
+    </w:p>
+    <w:p>
+      <w:pPr>
+        <w:pStyle w:val="Prrafodelista"/>
+        <w:rPr>
+          <w:rFonts w:ascii="Arial" w:hAnsi="Arial" w:cs="Arial"/>
+          <w:color w:val="0070C0"/>
+        </w:rPr>
+      </w:pPr>
     </w:p>
     <w:p>
       <w:pPr>
@@ -968,11 +1253,66 @@
         <w:t>R:</w:t>
       </w:r>
       <w:r>
-        <w:rPr>
-          <w:rFonts w:ascii="Arial" w:hAnsi="Arial" w:cs="Arial"/>
-          <w:color w:val="0070C0"/>
-        </w:rPr>
-        <w:t>---</w:t>
+        <w:t xml:space="preserve"> </w:t>
+      </w:r>
+      <w:r>
+        <w:rPr>
+          <w:rFonts w:ascii="Arial" w:hAnsi="Arial" w:cs="Arial"/>
+          <w:color w:val="0070C0"/>
+        </w:rPr>
+        <w:t xml:space="preserve">La práctica XP más útil fue </w:t>
+      </w:r>
+      <w:r>
+        <w:rPr>
+          <w:rFonts w:ascii="Arial" w:hAnsi="Arial" w:cs="Arial"/>
+          <w:b/>
+          <w:bCs/>
+          <w:color w:val="0070C0"/>
+        </w:rPr>
+        <w:t xml:space="preserve">Pair </w:t>
+      </w:r>
+      <w:proofErr w:type="spellStart"/>
+      <w:r>
+        <w:rPr>
+          <w:rFonts w:ascii="Arial" w:hAnsi="Arial" w:cs="Arial"/>
+          <w:b/>
+          <w:bCs/>
+          <w:color w:val="0070C0"/>
+        </w:rPr>
+        <w:t>Programming</w:t>
+      </w:r>
+      <w:proofErr w:type="spellEnd"/>
+      <w:r>
+        <w:rPr>
+          <w:rFonts w:ascii="Arial" w:hAnsi="Arial" w:cs="Arial"/>
+          <w:b/>
+          <w:bCs/>
+          <w:color w:val="0070C0"/>
+        </w:rPr>
+        <w:t xml:space="preserve"> (Programación en Pareja)</w:t>
+      </w:r>
+      <w:r>
+        <w:rPr>
+          <w:rFonts w:ascii="Arial" w:hAnsi="Arial" w:cs="Arial"/>
+          <w:color w:val="0070C0"/>
+        </w:rPr>
+        <w:t xml:space="preserve">. Al trabajar juntos sobre la misma base de código, pudimos detectar errores de lógica, casos borde y </w:t>
+      </w:r>
+      <w:r>
+        <w:rPr>
+          <w:rFonts w:ascii="Arial" w:hAnsi="Arial" w:cs="Arial"/>
+          <w:i/>
+          <w:iCs/>
+          <w:color w:val="0070C0"/>
+        </w:rPr>
+        <w:t>bugs</w:t>
+      </w:r>
+      <w:r>
+        <w:rPr>
+          <w:rFonts w:ascii="Arial" w:hAnsi="Arial" w:cs="Arial"/>
+          <w:color w:val="0070C0"/>
+        </w:rPr>
+        <w:t xml:space="preserve"> en tiempo real antes de realizar las integraciones. Esto fue especialmente valioso al ajustar los métodos de sincronización gráfica y la adaptación de las pruebas invisibles, reduciendo sensiblemente el tiempo dedicado a la depuración.</w:t>
       </w:r>
     </w:p>
     <w:p>
@@ -1005,20 +1345,1038 @@
     <w:p>
       <w:pPr>
         <w:pStyle w:val="NormalWeb"/>
+        <w:numPr>
+          <w:ilvl w:val="0"/>
+          <w:numId w:val="5"/>
+        </w:numPr>
+        <w:rPr>
+          <w:rFonts w:ascii="Arial" w:hAnsi="Arial" w:cs="Arial"/>
+          <w:color w:val="0070C0"/>
+          <w:lang w:val="en-US"/>
+        </w:rPr>
+      </w:pPr>
+      <w:r>
+        <w:rPr>
+          <w:rFonts w:ascii="Arial" w:hAnsi="Arial" w:cs="Arial"/>
+          <w:b/>
+          <w:bCs/>
+          <w:color w:val="0070C0"/>
+        </w:rPr>
+        <w:t>Oracle.</w:t>
+      </w:r>
+      <w:r>
+        <w:rPr>
+          <w:rFonts w:ascii="Arial" w:hAnsi="Arial" w:cs="Arial"/>
+          <w:color w:val="0070C0"/>
+          <w:lang w:val="en-US"/>
+        </w:rPr>
+        <w:t xml:space="preserve"> (2023). </w:t>
+      </w:r>
+      <w:proofErr w:type="spellStart"/>
+      <w:r>
+        <w:rPr>
+          <w:rFonts w:ascii="Arial" w:hAnsi="Arial" w:cs="Arial"/>
+          <w:i/>
+          <w:iCs/>
+          <w:color w:val="0070C0"/>
+          <w:lang w:val="en-US"/>
+        </w:rPr>
+        <w:t>Thread.sleep</w:t>
+      </w:r>
+      <w:proofErr w:type="spellEnd"/>
+      <w:r>
+        <w:rPr>
+          <w:rFonts w:ascii="Arial" w:hAnsi="Arial" w:cs="Arial"/>
+          <w:i/>
+          <w:iCs/>
+          <w:color w:val="0070C0"/>
+          <w:lang w:val="en-US"/>
+        </w:rPr>
+        <w:t>() - Class Thread Reference Documentation</w:t>
+      </w:r>
+      <w:r>
+        <w:rPr>
+          <w:rFonts w:ascii="Arial" w:hAnsi="Arial" w:cs="Arial"/>
+          <w:color w:val="0070C0"/>
+          <w:lang w:val="en-US"/>
+        </w:rPr>
+        <w:t xml:space="preserve">. </w:t>
+      </w:r>
+      <w:r>
+        <w:rPr>
+          <w:rFonts w:ascii="Arial" w:hAnsi="Arial" w:cs="Arial"/>
+          <w:color w:val="0070C0"/>
+          <w:lang w:val="en-US"/>
+        </w:rPr>
+        <w:t>Java Platform, Standard Edition 17 Development Kit Documentation. Oracle Corporation.</w:t>
+      </w:r>
+      <w:r>
+        <w:rPr>
+          <w:rFonts w:ascii="Arial" w:hAnsi="Arial" w:cs="Arial"/>
+          <w:color w:val="0070C0"/>
+          <w:lang w:val="en-US"/>
+        </w:rPr>
+        <w:t xml:space="preserve">  </w:t>
+      </w:r>
+      <w:hyperlink r:id="rId5" w:history="1">
+        <w:r>
+          <w:rPr>
+            <w:rStyle w:val="Hipervnculo"/>
+            <w:rFonts w:ascii="Arial" w:hAnsi="Arial" w:cs="Arial"/>
+            <w:lang w:val="en-US"/>
+          </w:rPr>
+          <w:t>https://docs.oracle.com/javase/tutorial/essential/concurrency/sleep.html</w:t>
+        </w:r>
+      </w:hyperlink>
+    </w:p>
+    <w:p>
+      <w:pPr>
+        <w:pStyle w:val="NormalWeb"/>
         <w:ind w:left="720"/>
         <w:rPr>
           <w:rFonts w:ascii="Arial" w:hAnsi="Arial" w:cs="Arial"/>
+          <w:color w:val="0070C0"/>
           <w:lang w:val="en-US"/>
         </w:rPr>
       </w:pPr>
-      <w:r>
-        <w:rPr>
-          <w:rFonts w:ascii="Arial" w:hAnsi="Arial" w:cs="Arial"/>
+    </w:p>
+    <w:p>
+      <w:pPr>
+        <w:pStyle w:val="NormalWeb"/>
+        <w:numPr>
+          <w:ilvl w:val="0"/>
+          <w:numId w:val="5"/>
+        </w:numPr>
+        <w:rPr>
+          <w:rFonts w:ascii="Arial" w:hAnsi="Arial" w:cs="Arial"/>
+          <w:color w:val="0070C0"/>
+        </w:rPr>
+      </w:pPr>
+      <w:r>
+        <w:rPr>
+          <w:rFonts w:ascii="Arial" w:hAnsi="Arial" w:cs="Arial"/>
+          <w:b/>
+          <w:bCs/>
           <w:color w:val="0070C0"/>
           <w:lang w:val="en-US"/>
         </w:rPr>
-        <w:t>---</w:t>
-      </w:r>
+        <w:t>Anthropic.</w:t>
+      </w:r>
+      <w:r>
+        <w:rPr>
+          <w:rFonts w:ascii="Arial" w:hAnsi="Arial" w:cs="Arial"/>
+          <w:color w:val="0070C0"/>
+          <w:lang w:val="en-US"/>
+        </w:rPr>
+        <w:t xml:space="preserve"> (2024). </w:t>
+      </w:r>
+      <w:r>
+        <w:rPr>
+          <w:rFonts w:ascii="Arial" w:hAnsi="Arial" w:cs="Arial"/>
+          <w:i/>
+          <w:iCs/>
+          <w:color w:val="0070C0"/>
+          <w:lang w:val="en-US"/>
+        </w:rPr>
+        <w:t>Claude 3.5 Sonnet</w:t>
+      </w:r>
+      <w:r>
+        <w:rPr>
+          <w:rFonts w:ascii="Arial" w:hAnsi="Arial" w:cs="Arial"/>
+          <w:color w:val="0070C0"/>
+          <w:lang w:val="en-US"/>
+        </w:rPr>
+        <w:t xml:space="preserve"> [Modelo Large Language]. </w:t>
+      </w:r>
+      <w:proofErr w:type="spellStart"/>
+      <w:r>
+        <w:rPr>
+          <w:rFonts w:ascii="Arial" w:hAnsi="Arial" w:cs="Arial"/>
+          <w:color w:val="0070C0"/>
+        </w:rPr>
+        <w:t>Anthropic</w:t>
+      </w:r>
+      <w:proofErr w:type="spellEnd"/>
+      <w:r>
+        <w:rPr>
+          <w:rFonts w:ascii="Arial" w:hAnsi="Arial" w:cs="Arial"/>
+          <w:color w:val="0070C0"/>
+        </w:rPr>
+        <w:t xml:space="preserve">. </w:t>
+      </w:r>
+      <w:hyperlink r:id="rId6" w:tgtFrame="_blank" w:history="1">
+        <w:r>
+          <w:rPr>
+            <w:rStyle w:val="Hipervnculo"/>
+            <w:rFonts w:ascii="Arial" w:hAnsi="Arial" w:cs="Arial"/>
+          </w:rPr>
+          <w:t>https://www.anthropic.com</w:t>
+        </w:r>
+      </w:hyperlink>
+    </w:p>
+    <w:p>
+      <w:pPr>
+        <w:pStyle w:val="NormalWeb"/>
+        <w:numPr>
+          <w:ilvl w:val="0"/>
+          <w:numId w:val="6"/>
+        </w:numPr>
+        <w:rPr>
+          <w:rFonts w:ascii="Arial" w:hAnsi="Arial" w:cs="Arial"/>
+        </w:rPr>
+      </w:pPr>
+      <w:r>
+        <w:rPr>
+          <w:rFonts w:ascii="Arial" w:hAnsi="Arial" w:cs="Arial"/>
+          <w:b/>
+          <w:bCs/>
+          <w:color w:val="0070C0"/>
+        </w:rPr>
+        <w:t>Referencia más útil:</w:t>
+      </w:r>
+      <w:r>
+        <w:rPr>
+          <w:rFonts w:ascii="Arial" w:hAnsi="Arial" w:cs="Arial"/>
+          <w:color w:val="0070C0"/>
+        </w:rPr>
+        <w:t xml:space="preserve"> </w:t>
+      </w:r>
+      <w:r>
+        <w:rPr>
+          <w:rFonts w:ascii="Arial" w:hAnsi="Arial" w:cs="Arial"/>
+          <w:color w:val="0070C0"/>
+        </w:rPr>
+        <w:t xml:space="preserve">la más útil sin dudar fue la IA generativa, esto ya que me permitía acelerar la productividad del código, acceder a documentación rápidamente </w:t>
+      </w:r>
+      <w:r>
+        <w:rPr>
+          <w:rFonts w:ascii="Arial" w:hAnsi="Arial" w:cs="Arial"/>
+          <w:color w:val="0070C0"/>
+        </w:rPr>
+        <w:t>y poder descubrir nuevas formas de codificar.</w:t>
+      </w:r>
+      <w:r>
+        <w:rPr>
+          <w:rFonts w:ascii="Arial" w:hAnsi="Arial" w:cs="Arial"/>
+          <w:color w:val="0070C0"/>
+        </w:rPr>
+        <w:br/>
+      </w:r>
+      <w:r>
+        <w:rPr>
+          <w:rFonts w:ascii="Arial" w:hAnsi="Arial" w:cs="Arial"/>
+          <w:color w:val="0070C0"/>
+        </w:rPr>
+        <w:br/>
+      </w:r>
+      <w:r>
+        <w:rPr>
+          <w:rFonts w:ascii="Arial" w:hAnsi="Arial" w:cs="Arial"/>
+          <w:color w:val="0070C0"/>
+        </w:rPr>
+        <w:br/>
+      </w:r>
+      <w:r>
+        <w:rPr>
+          <w:rFonts w:ascii="Arial" w:hAnsi="Arial" w:cs="Arial"/>
+          <w:color w:val="0070C0"/>
+        </w:rPr>
+        <w:br/>
+      </w:r>
+      <w:r>
+        <w:rPr>
+          <w:rFonts w:ascii="Arial" w:hAnsi="Arial" w:cs="Arial"/>
+          <w:b/>
+          <w:bCs/>
+          <w:color w:val="0070C0"/>
+        </w:rPr>
+        <w:t>PRUEBAS DE ACEPTACION</w:t>
+      </w:r>
+    </w:p>
+    <w:p>
+      <w:pPr>
+        <w:pStyle w:val="NormalWeb"/>
+        <w:rPr>
+          <w:rFonts w:ascii="Arial" w:hAnsi="Arial" w:cs="Arial"/>
+          <w:b/>
+          <w:bCs/>
+          <w:color w:val="0070C0"/>
+        </w:rPr>
+      </w:pPr>
+      <w:r>
+        <w:rPr>
+          <w:rFonts w:ascii="Arial" w:hAnsi="Arial" w:cs="Arial"/>
+          <w:b/>
+          <w:bCs/>
+          <w:color w:val="0070C0"/>
+        </w:rPr>
+        <w:t xml:space="preserve">Prueba de Aceptación 1 — Configuración completa del tablero, redimensionamiento, detección de </w:t>
+      </w:r>
+      <w:proofErr w:type="spellStart"/>
+      <w:r>
+        <w:rPr>
+          <w:rFonts w:ascii="Arial" w:hAnsi="Arial" w:cs="Arial"/>
+          <w:b/>
+          <w:bCs/>
+          <w:color w:val="0070C0"/>
+        </w:rPr>
+        <w:t>jackpot</w:t>
+      </w:r>
+      <w:proofErr w:type="spellEnd"/>
+      <w:r>
+        <w:rPr>
+          <w:rFonts w:ascii="Arial" w:hAnsi="Arial" w:cs="Arial"/>
+          <w:b/>
+          <w:bCs/>
+          <w:color w:val="0070C0"/>
+        </w:rPr>
+        <w:t xml:space="preserve"> y </w:t>
+      </w:r>
+      <w:r>
+        <w:rPr>
+          <w:rFonts w:ascii="Arial" w:hAnsi="Arial" w:cs="Arial"/>
+          <w:b/>
+          <w:bCs/>
+          <w:color w:val="0070C0"/>
+        </w:rPr>
+        <w:t>reinicio</w:t>
+      </w:r>
+    </w:p>
+    <w:p>
+      <w:pPr>
+        <w:pStyle w:val="NormalWeb"/>
+        <w:numPr>
+          <w:ilvl w:val="0"/>
+          <w:numId w:val="7"/>
+        </w:numPr>
+        <w:rPr>
+          <w:rFonts w:ascii="Arial" w:hAnsi="Arial" w:cs="Arial"/>
+          <w:b/>
+          <w:bCs/>
+          <w:color w:val="0070C0"/>
+        </w:rPr>
+      </w:pPr>
+      <w:r>
+        <w:rPr>
+          <w:rFonts w:ascii="Arial" w:hAnsi="Arial" w:cs="Arial"/>
+          <w:b/>
+          <w:bCs/>
+          <w:color w:val="0070C0"/>
+        </w:rPr>
+        <w:t xml:space="preserve">Crear una nueva </w:t>
+      </w:r>
+      <w:proofErr w:type="spellStart"/>
+      <w:r>
+        <w:rPr>
+          <w:rFonts w:ascii="Arial" w:hAnsi="Arial" w:cs="Arial"/>
+          <w:b/>
+          <w:bCs/>
+          <w:color w:val="0070C0"/>
+        </w:rPr>
+        <w:t>SlotMachine</w:t>
+      </w:r>
+      <w:proofErr w:type="spellEnd"/>
+      <w:r>
+        <w:rPr>
+          <w:rFonts w:ascii="Arial" w:hAnsi="Arial" w:cs="Arial"/>
+          <w:b/>
+          <w:bCs/>
+          <w:color w:val="0070C0"/>
+        </w:rPr>
+        <w:t>.</w:t>
+      </w:r>
+    </w:p>
+    <w:p>
+      <w:pPr>
+        <w:pStyle w:val="NormalWeb"/>
+        <w:numPr>
+          <w:ilvl w:val="0"/>
+          <w:numId w:val="7"/>
+        </w:numPr>
+        <w:rPr>
+          <w:rFonts w:ascii="Arial" w:hAnsi="Arial" w:cs="Arial"/>
+          <w:b/>
+          <w:bCs/>
+          <w:color w:val="0070C0"/>
+        </w:rPr>
+      </w:pPr>
+      <w:r>
+        <w:rPr>
+          <w:rFonts w:ascii="Arial" w:hAnsi="Arial" w:cs="Arial"/>
+          <w:b/>
+          <w:bCs/>
+          <w:color w:val="0070C0"/>
+        </w:rPr>
+        <w:t>Agregar ruedas en las posiciones 1 a la 15 (esto obliga al tablero a crecer más allá de MAX_COLUMNS y pasar a una segunda fila).</w:t>
+      </w:r>
+    </w:p>
+    <w:p>
+      <w:pPr>
+        <w:pStyle w:val="NormalWeb"/>
+        <w:numPr>
+          <w:ilvl w:val="0"/>
+          <w:numId w:val="7"/>
+        </w:numPr>
+        <w:rPr>
+          <w:rFonts w:ascii="Arial" w:hAnsi="Arial" w:cs="Arial"/>
+          <w:b/>
+          <w:bCs/>
+          <w:color w:val="0070C0"/>
+        </w:rPr>
+      </w:pPr>
+      <w:r>
+        <w:rPr>
+          <w:rFonts w:ascii="Arial" w:hAnsi="Arial" w:cs="Arial"/>
+          <w:b/>
+          <w:bCs/>
+          <w:color w:val="0070C0"/>
+        </w:rPr>
+        <w:t>Agregar tres símbolos: "red", "blue", "</w:t>
+      </w:r>
+      <w:proofErr w:type="spellStart"/>
+      <w:r>
+        <w:rPr>
+          <w:rFonts w:ascii="Arial" w:hAnsi="Arial" w:cs="Arial"/>
+          <w:b/>
+          <w:bCs/>
+          <w:color w:val="0070C0"/>
+        </w:rPr>
+        <w:t>green</w:t>
+      </w:r>
+      <w:proofErr w:type="spellEnd"/>
+      <w:r>
+        <w:rPr>
+          <w:rFonts w:ascii="Arial" w:hAnsi="Arial" w:cs="Arial"/>
+          <w:b/>
+          <w:bCs/>
+          <w:color w:val="0070C0"/>
+        </w:rPr>
+        <w:t>".</w:t>
+      </w:r>
+    </w:p>
+    <w:p>
+      <w:pPr>
+        <w:pStyle w:val="NormalWeb"/>
+        <w:numPr>
+          <w:ilvl w:val="0"/>
+          <w:numId w:val="7"/>
+        </w:numPr>
+        <w:rPr>
+          <w:rFonts w:ascii="Arial" w:hAnsi="Arial" w:cs="Arial"/>
+          <w:b/>
+          <w:bCs/>
+          <w:color w:val="0070C0"/>
+        </w:rPr>
+      </w:pPr>
+      <w:r>
+        <w:rPr>
+          <w:rFonts w:ascii="Arial" w:hAnsi="Arial" w:cs="Arial"/>
+          <w:b/>
+          <w:bCs/>
+          <w:color w:val="0070C0"/>
+        </w:rPr>
+        <w:lastRenderedPageBreak/>
+        <w:t>Fijar una configuración manual con spin(new String[]{"</w:t>
+      </w:r>
+      <w:proofErr w:type="spellStart"/>
+      <w:r>
+        <w:rPr>
+          <w:rFonts w:ascii="Arial" w:hAnsi="Arial" w:cs="Arial"/>
+          <w:b/>
+          <w:bCs/>
+          <w:color w:val="0070C0"/>
+        </w:rPr>
+        <w:t>red","red","red</w:t>
+      </w:r>
+      <w:proofErr w:type="spellEnd"/>
+      <w:r>
+        <w:rPr>
+          <w:rFonts w:ascii="Arial" w:hAnsi="Arial" w:cs="Arial"/>
+          <w:b/>
+          <w:bCs/>
+          <w:color w:val="0070C0"/>
+        </w:rPr>
+        <w:t>",...}) (15 elementos, todos "red") para que todas las ruedas muestren el mismo símbolo.</w:t>
+      </w:r>
+    </w:p>
+    <w:p>
+      <w:pPr>
+        <w:pStyle w:val="NormalWeb"/>
+        <w:numPr>
+          <w:ilvl w:val="0"/>
+          <w:numId w:val="7"/>
+        </w:numPr>
+        <w:rPr>
+          <w:rFonts w:ascii="Arial" w:hAnsi="Arial" w:cs="Arial"/>
+          <w:b/>
+          <w:bCs/>
+          <w:color w:val="0070C0"/>
+        </w:rPr>
+      </w:pPr>
+      <w:r>
+        <w:rPr>
+          <w:rFonts w:ascii="Arial" w:hAnsi="Arial" w:cs="Arial"/>
+          <w:b/>
+          <w:bCs/>
+          <w:color w:val="0070C0"/>
+        </w:rPr>
+        <w:t xml:space="preserve">Verificar que </w:t>
+      </w:r>
+      <w:proofErr w:type="spellStart"/>
+      <w:r>
+        <w:rPr>
+          <w:rFonts w:ascii="Arial" w:hAnsi="Arial" w:cs="Arial"/>
+          <w:b/>
+          <w:bCs/>
+          <w:color w:val="0070C0"/>
+        </w:rPr>
+        <w:t>isJackpot</w:t>
+      </w:r>
+      <w:proofErr w:type="spellEnd"/>
+      <w:r>
+        <w:rPr>
+          <w:rFonts w:ascii="Arial" w:hAnsi="Arial" w:cs="Arial"/>
+          <w:b/>
+          <w:bCs/>
+          <w:color w:val="0070C0"/>
+        </w:rPr>
+        <w:t>() retorne true.</w:t>
+      </w:r>
+    </w:p>
+    <w:p>
+      <w:pPr>
+        <w:pStyle w:val="NormalWeb"/>
+        <w:numPr>
+          <w:ilvl w:val="0"/>
+          <w:numId w:val="7"/>
+        </w:numPr>
+        <w:rPr>
+          <w:rFonts w:ascii="Arial" w:hAnsi="Arial" w:cs="Arial"/>
+          <w:b/>
+          <w:bCs/>
+          <w:color w:val="0070C0"/>
+        </w:rPr>
+      </w:pPr>
+      <w:r>
+        <w:rPr>
+          <w:rFonts w:ascii="Arial" w:hAnsi="Arial" w:cs="Arial"/>
+          <w:b/>
+          <w:bCs/>
+          <w:color w:val="0070C0"/>
+        </w:rPr>
+        <w:t xml:space="preserve">Eliminar la rueda en la posición 15 con </w:t>
+      </w:r>
+      <w:proofErr w:type="spellStart"/>
+      <w:r>
+        <w:rPr>
+          <w:rFonts w:ascii="Arial" w:hAnsi="Arial" w:cs="Arial"/>
+          <w:b/>
+          <w:bCs/>
+          <w:color w:val="0070C0"/>
+        </w:rPr>
+        <w:t>delWheel</w:t>
+      </w:r>
+      <w:proofErr w:type="spellEnd"/>
+      <w:r>
+        <w:rPr>
+          <w:rFonts w:ascii="Arial" w:hAnsi="Arial" w:cs="Arial"/>
+          <w:b/>
+          <w:bCs/>
+          <w:color w:val="0070C0"/>
+        </w:rPr>
+        <w:t>(15).</w:t>
+      </w:r>
+    </w:p>
+    <w:p>
+      <w:pPr>
+        <w:pStyle w:val="NormalWeb"/>
+        <w:numPr>
+          <w:ilvl w:val="0"/>
+          <w:numId w:val="7"/>
+        </w:numPr>
+        <w:rPr>
+          <w:rFonts w:ascii="Arial" w:hAnsi="Arial" w:cs="Arial"/>
+          <w:b/>
+          <w:bCs/>
+          <w:color w:val="0070C0"/>
+        </w:rPr>
+      </w:pPr>
+      <w:r>
+        <w:rPr>
+          <w:rFonts w:ascii="Arial" w:hAnsi="Arial" w:cs="Arial"/>
+          <w:b/>
+          <w:bCs/>
+          <w:color w:val="0070C0"/>
+        </w:rPr>
+        <w:t xml:space="preserve">Verificar que el tablero se reduzca correctamente a una sola fila, y que </w:t>
+      </w:r>
+      <w:proofErr w:type="spellStart"/>
+      <w:r>
+        <w:rPr>
+          <w:rFonts w:ascii="Arial" w:hAnsi="Arial" w:cs="Arial"/>
+          <w:b/>
+          <w:bCs/>
+          <w:color w:val="0070C0"/>
+        </w:rPr>
+        <w:t>isJackpot</w:t>
+      </w:r>
+      <w:proofErr w:type="spellEnd"/>
+      <w:r>
+        <w:rPr>
+          <w:rFonts w:ascii="Arial" w:hAnsi="Arial" w:cs="Arial"/>
+          <w:b/>
+          <w:bCs/>
+          <w:color w:val="0070C0"/>
+        </w:rPr>
+        <w:t>() siga retornando true para las 14 ruedas restantes.</w:t>
+      </w:r>
+    </w:p>
+    <w:p>
+      <w:pPr>
+        <w:pStyle w:val="NormalWeb"/>
+        <w:numPr>
+          <w:ilvl w:val="0"/>
+          <w:numId w:val="7"/>
+        </w:numPr>
+        <w:rPr>
+          <w:rFonts w:ascii="Arial" w:hAnsi="Arial" w:cs="Arial"/>
+          <w:b/>
+          <w:bCs/>
+          <w:color w:val="0070C0"/>
+        </w:rPr>
+      </w:pPr>
+      <w:r>
+        <w:rPr>
+          <w:rFonts w:ascii="Arial" w:hAnsi="Arial" w:cs="Arial"/>
+          <w:b/>
+          <w:bCs/>
+          <w:color w:val="0070C0"/>
+        </w:rPr>
+        <w:t xml:space="preserve">Cambiar el símbolo de una rueda con </w:t>
+      </w:r>
+      <w:proofErr w:type="spellStart"/>
+      <w:r>
+        <w:rPr>
+          <w:rFonts w:ascii="Arial" w:hAnsi="Arial" w:cs="Arial"/>
+          <w:b/>
+          <w:bCs/>
+          <w:color w:val="0070C0"/>
+        </w:rPr>
+        <w:t>placeSymbol</w:t>
+      </w:r>
+      <w:proofErr w:type="spellEnd"/>
+      <w:r>
+        <w:rPr>
+          <w:rFonts w:ascii="Arial" w:hAnsi="Arial" w:cs="Arial"/>
+          <w:b/>
+          <w:bCs/>
+          <w:color w:val="0070C0"/>
+        </w:rPr>
+        <w:t>(5, "blue").</w:t>
+      </w:r>
+    </w:p>
+    <w:p>
+      <w:pPr>
+        <w:pStyle w:val="NormalWeb"/>
+        <w:numPr>
+          <w:ilvl w:val="0"/>
+          <w:numId w:val="7"/>
+        </w:numPr>
+        <w:rPr>
+          <w:rFonts w:ascii="Arial" w:hAnsi="Arial" w:cs="Arial"/>
+          <w:b/>
+          <w:bCs/>
+          <w:color w:val="0070C0"/>
+        </w:rPr>
+      </w:pPr>
+      <w:r>
+        <w:rPr>
+          <w:rFonts w:ascii="Arial" w:hAnsi="Arial" w:cs="Arial"/>
+          <w:b/>
+          <w:bCs/>
+          <w:color w:val="0070C0"/>
+        </w:rPr>
+        <w:t xml:space="preserve">Verificar que </w:t>
+      </w:r>
+      <w:proofErr w:type="spellStart"/>
+      <w:r>
+        <w:rPr>
+          <w:rFonts w:ascii="Arial" w:hAnsi="Arial" w:cs="Arial"/>
+          <w:b/>
+          <w:bCs/>
+          <w:color w:val="0070C0"/>
+        </w:rPr>
+        <w:t>isJackpot</w:t>
+      </w:r>
+      <w:proofErr w:type="spellEnd"/>
+      <w:r>
+        <w:rPr>
+          <w:rFonts w:ascii="Arial" w:hAnsi="Arial" w:cs="Arial"/>
+          <w:b/>
+          <w:bCs/>
+          <w:color w:val="0070C0"/>
+        </w:rPr>
+        <w:t xml:space="preserve">() ahora retorne false, y que </w:t>
+      </w:r>
+      <w:proofErr w:type="spellStart"/>
+      <w:r>
+        <w:rPr>
+          <w:rFonts w:ascii="Arial" w:hAnsi="Arial" w:cs="Arial"/>
+          <w:b/>
+          <w:bCs/>
+          <w:color w:val="0070C0"/>
+        </w:rPr>
+        <w:t>distinctSymbols</w:t>
+      </w:r>
+      <w:proofErr w:type="spellEnd"/>
+      <w:r>
+        <w:rPr>
+          <w:rFonts w:ascii="Arial" w:hAnsi="Arial" w:cs="Arial"/>
+          <w:b/>
+          <w:bCs/>
+          <w:color w:val="0070C0"/>
+        </w:rPr>
+        <w:t>() retorne 2.</w:t>
+      </w:r>
+    </w:p>
+    <w:p>
+      <w:pPr>
+        <w:pStyle w:val="NormalWeb"/>
+        <w:rPr>
+          <w:rFonts w:ascii="Arial" w:hAnsi="Arial" w:cs="Arial"/>
+          <w:b/>
+          <w:bCs/>
+          <w:color w:val="0070C0"/>
+        </w:rPr>
+      </w:pPr>
+    </w:p>
+    <w:p>
+      <w:pPr>
+        <w:pStyle w:val="NormalWeb"/>
+        <w:rPr>
+          <w:rFonts w:ascii="Arial" w:hAnsi="Arial" w:cs="Arial"/>
+          <w:b/>
+          <w:bCs/>
+          <w:color w:val="0070C0"/>
+        </w:rPr>
+      </w:pPr>
+      <w:r>
+        <w:rPr>
+          <w:rFonts w:ascii="Arial" w:hAnsi="Arial" w:cs="Arial"/>
+          <w:b/>
+          <w:bCs/>
+          <w:color w:val="0070C0"/>
+        </w:rPr>
+        <w:t>Prueba de Aceptación 2 — Bloqueo, intercambio y giro interactúan correctamente</w:t>
+      </w:r>
+    </w:p>
+    <w:p>
+      <w:pPr>
+        <w:pStyle w:val="NormalWeb"/>
+        <w:numPr>
+          <w:ilvl w:val="0"/>
+          <w:numId w:val="8"/>
+        </w:numPr>
+        <w:rPr>
+          <w:rFonts w:ascii="Arial" w:hAnsi="Arial" w:cs="Arial"/>
+          <w:b/>
+          <w:bCs/>
+          <w:color w:val="0070C0"/>
+        </w:rPr>
+      </w:pPr>
+      <w:r>
+        <w:rPr>
+          <w:rFonts w:ascii="Arial" w:hAnsi="Arial" w:cs="Arial"/>
+          <w:b/>
+          <w:bCs/>
+          <w:color w:val="0070C0"/>
+        </w:rPr>
+        <w:t xml:space="preserve">Crear una nueva </w:t>
+      </w:r>
+      <w:proofErr w:type="spellStart"/>
+      <w:r>
+        <w:rPr>
+          <w:rFonts w:ascii="Arial" w:hAnsi="Arial" w:cs="Arial"/>
+          <w:b/>
+          <w:bCs/>
+          <w:color w:val="0070C0"/>
+        </w:rPr>
+        <w:t>SlotMachine</w:t>
+      </w:r>
+      <w:proofErr w:type="spellEnd"/>
+      <w:r>
+        <w:rPr>
+          <w:rFonts w:ascii="Arial" w:hAnsi="Arial" w:cs="Arial"/>
+          <w:b/>
+          <w:bCs/>
+          <w:color w:val="0070C0"/>
+        </w:rPr>
+        <w:t>.</w:t>
+      </w:r>
+    </w:p>
+    <w:p>
+      <w:pPr>
+        <w:pStyle w:val="NormalWeb"/>
+        <w:numPr>
+          <w:ilvl w:val="0"/>
+          <w:numId w:val="8"/>
+        </w:numPr>
+        <w:rPr>
+          <w:rFonts w:ascii="Arial" w:hAnsi="Arial" w:cs="Arial"/>
+          <w:b/>
+          <w:bCs/>
+          <w:color w:val="0070C0"/>
+        </w:rPr>
+      </w:pPr>
+      <w:r>
+        <w:rPr>
+          <w:rFonts w:ascii="Arial" w:hAnsi="Arial" w:cs="Arial"/>
+          <w:b/>
+          <w:bCs/>
+          <w:color w:val="0070C0"/>
+        </w:rPr>
+        <w:t>Agregar tres ruedas, en las posiciones 1, 2 y 3.</w:t>
+      </w:r>
+    </w:p>
+    <w:p>
+      <w:pPr>
+        <w:pStyle w:val="NormalWeb"/>
+        <w:numPr>
+          <w:ilvl w:val="0"/>
+          <w:numId w:val="8"/>
+        </w:numPr>
+        <w:rPr>
+          <w:rFonts w:ascii="Arial" w:hAnsi="Arial" w:cs="Arial"/>
+          <w:b/>
+          <w:bCs/>
+          <w:color w:val="0070C0"/>
+        </w:rPr>
+      </w:pPr>
+      <w:r>
+        <w:rPr>
+          <w:rFonts w:ascii="Arial" w:hAnsi="Arial" w:cs="Arial"/>
+          <w:b/>
+          <w:bCs/>
+          <w:color w:val="0070C0"/>
+        </w:rPr>
+        <w:t>Agregar dos símbolos: "red" y "blue".</w:t>
+      </w:r>
+    </w:p>
+    <w:p>
+      <w:pPr>
+        <w:pStyle w:val="NormalWeb"/>
+        <w:numPr>
+          <w:ilvl w:val="0"/>
+          <w:numId w:val="8"/>
+        </w:numPr>
+        <w:rPr>
+          <w:rFonts w:ascii="Arial" w:hAnsi="Arial" w:cs="Arial"/>
+          <w:b/>
+          <w:bCs/>
+          <w:color w:val="0070C0"/>
+        </w:rPr>
+      </w:pPr>
+      <w:r>
+        <w:rPr>
+          <w:rFonts w:ascii="Arial" w:hAnsi="Arial" w:cs="Arial"/>
+          <w:b/>
+          <w:bCs/>
+          <w:color w:val="0070C0"/>
+        </w:rPr>
+        <w:t>Colocar "red" en la rueda 1, "blue" en la rueda 2, y "red" en la rueda 3.</w:t>
+      </w:r>
+    </w:p>
+    <w:p>
+      <w:pPr>
+        <w:pStyle w:val="NormalWeb"/>
+        <w:numPr>
+          <w:ilvl w:val="0"/>
+          <w:numId w:val="8"/>
+        </w:numPr>
+        <w:rPr>
+          <w:rFonts w:ascii="Arial" w:hAnsi="Arial" w:cs="Arial"/>
+          <w:b/>
+          <w:bCs/>
+          <w:color w:val="0070C0"/>
+        </w:rPr>
+      </w:pPr>
+      <w:r>
+        <w:rPr>
+          <w:rFonts w:ascii="Arial" w:hAnsi="Arial" w:cs="Arial"/>
+          <w:b/>
+          <w:bCs/>
+          <w:color w:val="0070C0"/>
+        </w:rPr>
+        <w:t xml:space="preserve">Bloquear la rueda 2 con </w:t>
+      </w:r>
+      <w:proofErr w:type="spellStart"/>
+      <w:r>
+        <w:rPr>
+          <w:rFonts w:ascii="Arial" w:hAnsi="Arial" w:cs="Arial"/>
+          <w:b/>
+          <w:bCs/>
+          <w:color w:val="0070C0"/>
+        </w:rPr>
+        <w:t>lock</w:t>
+      </w:r>
+      <w:proofErr w:type="spellEnd"/>
+      <w:r>
+        <w:rPr>
+          <w:rFonts w:ascii="Arial" w:hAnsi="Arial" w:cs="Arial"/>
+          <w:b/>
+          <w:bCs/>
+          <w:color w:val="0070C0"/>
+        </w:rPr>
+        <w:t>(2).</w:t>
+      </w:r>
+    </w:p>
+    <w:p>
+      <w:pPr>
+        <w:pStyle w:val="NormalWeb"/>
+        <w:numPr>
+          <w:ilvl w:val="0"/>
+          <w:numId w:val="8"/>
+        </w:numPr>
+        <w:rPr>
+          <w:rFonts w:ascii="Arial" w:hAnsi="Arial" w:cs="Arial"/>
+          <w:b/>
+          <w:bCs/>
+          <w:color w:val="0070C0"/>
+        </w:rPr>
+      </w:pPr>
+      <w:r>
+        <w:rPr>
+          <w:rFonts w:ascii="Arial" w:hAnsi="Arial" w:cs="Arial"/>
+          <w:b/>
+          <w:bCs/>
+          <w:color w:val="0070C0"/>
+        </w:rPr>
+        <w:t>Intentar spin(2) — verificar que ok() retorne false y que el símbolo de la rueda 2 no haya cambiado.</w:t>
+      </w:r>
+    </w:p>
+    <w:p>
+      <w:pPr>
+        <w:pStyle w:val="NormalWeb"/>
+        <w:numPr>
+          <w:ilvl w:val="0"/>
+          <w:numId w:val="8"/>
+        </w:numPr>
+        <w:rPr>
+          <w:rFonts w:ascii="Arial" w:hAnsi="Arial" w:cs="Arial"/>
+          <w:b/>
+          <w:bCs/>
+          <w:color w:val="0070C0"/>
+        </w:rPr>
+      </w:pPr>
+      <w:r>
+        <w:rPr>
+          <w:rFonts w:ascii="Arial" w:hAnsi="Arial" w:cs="Arial"/>
+          <w:b/>
+          <w:bCs/>
+          <w:color w:val="0070C0"/>
+        </w:rPr>
+        <w:t>Intentar swap(1, 2) — verificar que ok() retorne false (una rueda bloqueada tampoco puede intercambiarse) y que ni la rueda 1 ni la rueda 2 cambiaron de posición o símbolo.</w:t>
+      </w:r>
+    </w:p>
+    <w:p>
+      <w:pPr>
+        <w:pStyle w:val="NormalWeb"/>
+        <w:numPr>
+          <w:ilvl w:val="0"/>
+          <w:numId w:val="8"/>
+        </w:numPr>
+        <w:rPr>
+          <w:rFonts w:ascii="Arial" w:hAnsi="Arial" w:cs="Arial"/>
+          <w:b/>
+          <w:bCs/>
+          <w:color w:val="0070C0"/>
+        </w:rPr>
+      </w:pPr>
+      <w:r>
+        <w:rPr>
+          <w:rFonts w:ascii="Arial" w:hAnsi="Arial" w:cs="Arial"/>
+          <w:b/>
+          <w:bCs/>
+          <w:color w:val="0070C0"/>
+        </w:rPr>
+        <w:t xml:space="preserve">Desbloquear la rueda 2 con </w:t>
+      </w:r>
+      <w:proofErr w:type="spellStart"/>
+      <w:r>
+        <w:rPr>
+          <w:rFonts w:ascii="Arial" w:hAnsi="Arial" w:cs="Arial"/>
+          <w:b/>
+          <w:bCs/>
+          <w:color w:val="0070C0"/>
+        </w:rPr>
+        <w:t>unlock</w:t>
+      </w:r>
+      <w:proofErr w:type="spellEnd"/>
+      <w:r>
+        <w:rPr>
+          <w:rFonts w:ascii="Arial" w:hAnsi="Arial" w:cs="Arial"/>
+          <w:b/>
+          <w:bCs/>
+          <w:color w:val="0070C0"/>
+        </w:rPr>
+        <w:t>(2).</w:t>
+      </w:r>
+    </w:p>
+    <w:p>
+      <w:pPr>
+        <w:pStyle w:val="NormalWeb"/>
+        <w:numPr>
+          <w:ilvl w:val="0"/>
+          <w:numId w:val="8"/>
+        </w:numPr>
+        <w:rPr>
+          <w:rFonts w:ascii="Arial" w:hAnsi="Arial" w:cs="Arial"/>
+          <w:b/>
+          <w:bCs/>
+          <w:color w:val="0070C0"/>
+        </w:rPr>
+      </w:pPr>
+      <w:r>
+        <w:rPr>
+          <w:rFonts w:ascii="Arial" w:hAnsi="Arial" w:cs="Arial"/>
+          <w:b/>
+          <w:bCs/>
+          <w:color w:val="0070C0"/>
+        </w:rPr>
+        <w:t>Intercambiar la rueda 2 y la rueda 3 con swap(2, 3) — verificar que la rueda 2 ahora muestre "red" y la rueda 3 ahora muestre "blue".</w:t>
+      </w:r>
+    </w:p>
+    <w:p>
+      <w:pPr>
+        <w:pStyle w:val="NormalWeb"/>
+        <w:numPr>
+          <w:ilvl w:val="0"/>
+          <w:numId w:val="8"/>
+        </w:numPr>
+        <w:rPr>
+          <w:rFonts w:ascii="Arial" w:hAnsi="Arial" w:cs="Arial"/>
+          <w:b/>
+          <w:bCs/>
+          <w:color w:val="0070C0"/>
+        </w:rPr>
+      </w:pPr>
+      <w:r>
+        <w:rPr>
+          <w:rFonts w:ascii="Arial" w:hAnsi="Arial" w:cs="Arial"/>
+          <w:b/>
+          <w:bCs/>
+          <w:color w:val="0070C0"/>
+        </w:rPr>
+        <w:t>Girar la rueda 2 con spin(2, 3) (tres pasos) — verificar que el símbolo de la rueda cambió a un símbolo válido registrado ("red" o "blue") y que ok() retorne true.</w:t>
+      </w:r>
+    </w:p>
+    <w:p>
+      <w:pPr>
+        <w:pStyle w:val="NormalWeb"/>
+        <w:rPr>
+          <w:rFonts w:ascii="Arial" w:hAnsi="Arial" w:cs="Arial"/>
+        </w:rPr>
+      </w:pPr>
     </w:p>
     <w:sectPr>
       <w:pgSz w:w="12240" w:h="15840"/>
@@ -1031,8 +2389,121 @@
 </file>
 
 <file path=word/numbering.xml><?xml version="1.0" encoding="utf-8"?>
-<w:numbering xmlns:wpc="http://schemas.microsoft.com/office/word/2010/wordprocessingCanvas" xmlns:cx="http://schemas.microsoft.com/office/drawing/2014/chartex" xmlns:cx1="http://schemas.microsoft.com/office/drawing/2015/9/8/chartex" xmlns:cx2="http://schemas.microsoft.com/office/drawing/2015/10/21/chartex" xmlns:cx3="http://schemas.microsoft.com/office/drawing/2016/5/9/chartex" xmlns:cx4="http://schemas.microsoft.com/office/drawing/2016/5/10/chartex" xmlns:cx5="http://schemas.microsoft.com/office/drawing/2016/5/11/chartex" xmlns:cx6="http://schemas.microsoft.com/office/drawing/2016/5/12/chartex" xmlns:cx7="http://schemas.microsoft.com/office/drawing/2016/5/13/chartex" xmlns:cx8="http://schemas.microsoft.com/office/drawing/2016/5/14/chartex" xmlns:mc="http://schemas.openxmlformats.org/markup-compatibility/2006" xmlns:aink="http://schemas.microsoft.com/office/drawing/2016/ink" xmlns:am3d="http://schemas.microsoft.com/office/drawing/2017/model3d" xmlns:o="urn:schemas-microsoft-com:office:office" xmlns:r="http://schemas.openxmlformats.org/officeDocument/2006/relationships" xmlns:m="http://schemas.openxmlformats.org/officeDocument/2006/math" xmlns:v="urn:schemas-microsoft-com:vml" xmlns:wp14="http://schemas.microsoft.com/office/word/2010/wordprocessingDrawing" xmlns:wp="http://schemas.openxmlformats.org/drawingml/2006/wordprocessingDrawing" xmlns:w10="urn:schemas-microsoft-com:office:word" xmlns:w="http://schemas.openxmlformats.org/wordprocessingml/2006/main" xmlns:w14="http://schemas.microsoft.com/office/word/2010/wordml" xmlns:w15="http://schemas.microsoft.com/office/word/2012/wordml" xmlns:w16cex="http://schemas.microsoft.com/office/word/2018/wordml/cex" xmlns:w16cid="http://schemas.microsoft.com/office/word/2016/wordml/cid" xmlns:w16="http://schemas.microsoft.com/office/word/2018/wordml" xmlns:w16sdtdh="http://schemas.microsoft.com/office/word/2020/wordml/sdtdatahash" xmlns:w16se="http://schemas.microsoft.com/office/word/2015/wordml/symex" xmlns:wpg="http://schemas.microsoft.com/office/word/2010/wordprocessingGroup" xmlns:wpi="http://schemas.microsoft.com/office/word/2010/wordprocessingInk" xmlns:wne="http://schemas.microsoft.com/office/word/2006/wordml" xmlns:wps="http://schemas.microsoft.com/office/word/2010/wordprocessingShape" mc:Ignorable="w14 w15 w16se w16cid w16 w16cex w16sdtdh wp14">
+<w:numbering xmlns:wpc="http://schemas.microsoft.com/office/word/2010/wordprocessingCanvas" xmlns:cx="http://schemas.microsoft.com/office/drawing/2014/chartex" xmlns:cx1="http://schemas.microsoft.com/office/drawing/2015/9/8/chartex" xmlns:cx2="http://schemas.microsoft.com/office/drawing/2015/10/21/chartex" xmlns:cx3="http://schemas.microsoft.com/office/drawing/2016/5/9/chartex" xmlns:cx4="http://schemas.microsoft.com/office/drawing/2016/5/10/chartex" xmlns:cx5="http://schemas.microsoft.com/office/drawing/2016/5/11/chartex" xmlns:cx6="http://schemas.microsoft.com/office/drawing/2016/5/12/chartex" xmlns:cx7="http://schemas.microsoft.com/office/drawing/2016/5/13/chartex" xmlns:cx8="http://schemas.microsoft.com/office/drawing/2016/5/14/chartex" xmlns:mc="http://schemas.openxmlformats.org/markup-compatibility/2006" xmlns:aink="http://schemas.microsoft.com/office/drawing/2016/ink" xmlns:am3d="http://schemas.microsoft.com/office/drawing/2017/model3d" xmlns:o="urn:schemas-microsoft-com:office:office" xmlns:oel="http://schemas.microsoft.com/office/2019/extlst" xmlns:r="http://schemas.openxmlformats.org/officeDocument/2006/relationships" xmlns:m="http://schemas.openxmlformats.org/officeDocument/2006/math" xmlns:v="urn:schemas-microsoft-com:vml" xmlns:wp14="http://schemas.microsoft.com/office/word/2010/wordprocessingDrawing" xmlns:wp="http://schemas.openxmlformats.org/drawingml/2006/wordprocessingDrawing" xmlns:w10="urn:schemas-microsoft-com:office:word" xmlns:w="http://schemas.openxmlformats.org/wordprocessingml/2006/main" xmlns:w14="http://schemas.microsoft.com/office/word/2010/wordml" xmlns:w15="http://schemas.microsoft.com/office/word/2012/wordml" xmlns:w16cex="http://schemas.microsoft.com/office/word/2018/wordml/cex" xmlns:w16cid="http://schemas.microsoft.com/office/word/2016/wordml/cid" xmlns:w16="http://schemas.microsoft.com/office/word/2018/wordml" xmlns:w16du="http://schemas.microsoft.com/office/word/2023/wordml/word16du" xmlns:w16sdtdh="http://schemas.microsoft.com/office/word/2020/wordml/sdtdatahash" xmlns:w16sdtfl="http://schemas.microsoft.com/office/word/2024/wordml/sdtformatlock" xmlns:w16se="http://schemas.microsoft.com/office/word/2015/wordml/symex" xmlns:wpg="http://schemas.microsoft.com/office/word/2010/wordprocessingGroup" xmlns:wpi="http://schemas.microsoft.com/office/word/2010/wordprocessingInk" xmlns:wne="http://schemas.microsoft.com/office/word/2006/wordml" xmlns:wps="http://schemas.microsoft.com/office/word/2010/wordprocessingShape" mc:Ignorable="w14 w15 w16se w16cid w16 w16cex w16sdtdh w16sdtfl w16du wp14">
   <w:abstractNum w:abstractNumId="0" w15:restartNumberingAfterBreak="0">
+    <w:nsid w:val="12B31CFB"/>
+    <w:multiLevelType w:val="multilevel"/>
+    <w:tmpl w:val="E4820BE8"/>
+    <w:lvl w:ilvl="0">
+      <w:start w:val="1"/>
+      <w:numFmt w:val="decimal"/>
+      <w:lvlText w:val="%1."/>
+      <w:lvlJc w:val="left"/>
+      <w:pPr>
+        <w:tabs>
+          <w:tab w:val="num" w:pos="720"/>
+        </w:tabs>
+        <w:ind w:left="720" w:hanging="360"/>
+      </w:pPr>
+    </w:lvl>
+    <w:lvl w:ilvl="1" w:tentative="1">
+      <w:start w:val="1"/>
+      <w:numFmt w:val="decimal"/>
+      <w:lvlText w:val="%2."/>
+      <w:lvlJc w:val="left"/>
+      <w:pPr>
+        <w:tabs>
+          <w:tab w:val="num" w:pos="1440"/>
+        </w:tabs>
+        <w:ind w:left="1440" w:hanging="360"/>
+      </w:pPr>
+    </w:lvl>
+    <w:lvl w:ilvl="2" w:tentative="1">
+      <w:start w:val="1"/>
+      <w:numFmt w:val="decimal"/>
+      <w:lvlText w:val="%3."/>
+      <w:lvlJc w:val="left"/>
+      <w:pPr>
+        <w:tabs>
+          <w:tab w:val="num" w:pos="2160"/>
+        </w:tabs>
+        <w:ind w:left="2160" w:hanging="360"/>
+      </w:pPr>
+    </w:lvl>
+    <w:lvl w:ilvl="3" w:tentative="1">
+      <w:start w:val="1"/>
+      <w:numFmt w:val="decimal"/>
+      <w:lvlText w:val="%4."/>
+      <w:lvlJc w:val="left"/>
+      <w:pPr>
+        <w:tabs>
+          <w:tab w:val="num" w:pos="2880"/>
+        </w:tabs>
+        <w:ind w:left="2880" w:hanging="360"/>
+      </w:pPr>
+    </w:lvl>
+    <w:lvl w:ilvl="4" w:tentative="1">
+      <w:start w:val="1"/>
+      <w:numFmt w:val="decimal"/>
+      <w:lvlText w:val="%5."/>
+      <w:lvlJc w:val="left"/>
+      <w:pPr>
+        <w:tabs>
+          <w:tab w:val="num" w:pos="3600"/>
+        </w:tabs>
+        <w:ind w:left="3600" w:hanging="360"/>
+      </w:pPr>
+    </w:lvl>
+    <w:lvl w:ilvl="5" w:tentative="1">
+      <w:start w:val="1"/>
+      <w:numFmt w:val="decimal"/>
+      <w:lvlText w:val="%6."/>
+      <w:lvlJc w:val="left"/>
+      <w:pPr>
+        <w:tabs>
+          <w:tab w:val="num" w:pos="4320"/>
+        </w:tabs>
+        <w:ind w:left="4320" w:hanging="360"/>
+      </w:pPr>
+    </w:lvl>
+    <w:lvl w:ilvl="6" w:tentative="1">
+      <w:start w:val="1"/>
+      <w:numFmt w:val="decimal"/>
+      <w:lvlText w:val="%7."/>
+      <w:lvlJc w:val="left"/>
+      <w:pPr>
+        <w:tabs>
+          <w:tab w:val="num" w:pos="5040"/>
+        </w:tabs>
+        <w:ind w:left="5040" w:hanging="360"/>
+      </w:pPr>
+    </w:lvl>
+    <w:lvl w:ilvl="7" w:tentative="1">
+      <w:start w:val="1"/>
+      <w:numFmt w:val="decimal"/>
+      <w:lvlText w:val="%8."/>
+      <w:lvlJc w:val="left"/>
+      <w:pPr>
+        <w:tabs>
+          <w:tab w:val="num" w:pos="5760"/>
+        </w:tabs>
+        <w:ind w:left="5760" w:hanging="360"/>
+      </w:pPr>
+    </w:lvl>
+    <w:lvl w:ilvl="8" w:tentative="1">
+      <w:start w:val="1"/>
+      <w:numFmt w:val="decimal"/>
+      <w:lvlText w:val="%9."/>
+      <w:lvlJc w:val="left"/>
+      <w:pPr>
+        <w:tabs>
+          <w:tab w:val="num" w:pos="6480"/>
+        </w:tabs>
+        <w:ind w:left="6480" w:hanging="360"/>
+      </w:pPr>
+    </w:lvl>
+  </w:abstractNum>
+  <w:abstractNum w:abstractNumId="1" w15:restartNumberingAfterBreak="0">
     <w:nsid w:val="45767147"/>
     <w:multiLevelType w:val="hybridMultilevel"/>
     <w:tmpl w:val="897852FA"/>
@@ -1121,7 +2592,7 @@
       </w:pPr>
     </w:lvl>
   </w:abstractNum>
-  <w:abstractNum w:abstractNumId="1" w15:restartNumberingAfterBreak="0">
+  <w:abstractNum w:abstractNumId="2" w15:restartNumberingAfterBreak="0">
     <w:nsid w:val="45BF05ED"/>
     <w:multiLevelType w:val="hybridMultilevel"/>
     <w:tmpl w:val="63702B8C"/>
@@ -1210,7 +2681,7 @@
       </w:pPr>
     </w:lvl>
   </w:abstractNum>
-  <w:abstractNum w:abstractNumId="2" w15:restartNumberingAfterBreak="0">
+  <w:abstractNum w:abstractNumId="3" w15:restartNumberingAfterBreak="0">
     <w:nsid w:val="47234E64"/>
     <w:multiLevelType w:val="hybridMultilevel"/>
     <w:tmpl w:val="20C20130"/>
@@ -1322,7 +2793,120 @@
       </w:rPr>
     </w:lvl>
   </w:abstractNum>
-  <w:abstractNum w:abstractNumId="3" w15:restartNumberingAfterBreak="0">
+  <w:abstractNum w:abstractNumId="4" w15:restartNumberingAfterBreak="0">
+    <w:nsid w:val="504F2AFE"/>
+    <w:multiLevelType w:val="multilevel"/>
+    <w:tmpl w:val="2004B234"/>
+    <w:lvl w:ilvl="0">
+      <w:start w:val="1"/>
+      <w:numFmt w:val="decimal"/>
+      <w:lvlText w:val="%1."/>
+      <w:lvlJc w:val="left"/>
+      <w:pPr>
+        <w:tabs>
+          <w:tab w:val="num" w:pos="720"/>
+        </w:tabs>
+        <w:ind w:left="720" w:hanging="360"/>
+      </w:pPr>
+    </w:lvl>
+    <w:lvl w:ilvl="1" w:tentative="1">
+      <w:start w:val="1"/>
+      <w:numFmt w:val="decimal"/>
+      <w:lvlText w:val="%2."/>
+      <w:lvlJc w:val="left"/>
+      <w:pPr>
+        <w:tabs>
+          <w:tab w:val="num" w:pos="1440"/>
+        </w:tabs>
+        <w:ind w:left="1440" w:hanging="360"/>
+      </w:pPr>
+    </w:lvl>
+    <w:lvl w:ilvl="2" w:tentative="1">
+      <w:start w:val="1"/>
+      <w:numFmt w:val="decimal"/>
+      <w:lvlText w:val="%3."/>
+      <w:lvlJc w:val="left"/>
+      <w:pPr>
+        <w:tabs>
+          <w:tab w:val="num" w:pos="2160"/>
+        </w:tabs>
+        <w:ind w:left="2160" w:hanging="360"/>
+      </w:pPr>
+    </w:lvl>
+    <w:lvl w:ilvl="3" w:tentative="1">
+      <w:start w:val="1"/>
+      <w:numFmt w:val="decimal"/>
+      <w:lvlText w:val="%4."/>
+      <w:lvlJc w:val="left"/>
+      <w:pPr>
+        <w:tabs>
+          <w:tab w:val="num" w:pos="2880"/>
+        </w:tabs>
+        <w:ind w:left="2880" w:hanging="360"/>
+      </w:pPr>
+    </w:lvl>
+    <w:lvl w:ilvl="4" w:tentative="1">
+      <w:start w:val="1"/>
+      <w:numFmt w:val="decimal"/>
+      <w:lvlText w:val="%5."/>
+      <w:lvlJc w:val="left"/>
+      <w:pPr>
+        <w:tabs>
+          <w:tab w:val="num" w:pos="3600"/>
+        </w:tabs>
+        <w:ind w:left="3600" w:hanging="360"/>
+      </w:pPr>
+    </w:lvl>
+    <w:lvl w:ilvl="5" w:tentative="1">
+      <w:start w:val="1"/>
+      <w:numFmt w:val="decimal"/>
+      <w:lvlText w:val="%6."/>
+      <w:lvlJc w:val="left"/>
+      <w:pPr>
+        <w:tabs>
+          <w:tab w:val="num" w:pos="4320"/>
+        </w:tabs>
+        <w:ind w:left="4320" w:hanging="360"/>
+      </w:pPr>
+    </w:lvl>
+    <w:lvl w:ilvl="6" w:tentative="1">
+      <w:start w:val="1"/>
+      <w:numFmt w:val="decimal"/>
+      <w:lvlText w:val="%7."/>
+      <w:lvlJc w:val="left"/>
+      <w:pPr>
+        <w:tabs>
+          <w:tab w:val="num" w:pos="5040"/>
+        </w:tabs>
+        <w:ind w:left="5040" w:hanging="360"/>
+      </w:pPr>
+    </w:lvl>
+    <w:lvl w:ilvl="7" w:tentative="1">
+      <w:start w:val="1"/>
+      <w:numFmt w:val="decimal"/>
+      <w:lvlText w:val="%8."/>
+      <w:lvlJc w:val="left"/>
+      <w:pPr>
+        <w:tabs>
+          <w:tab w:val="num" w:pos="5760"/>
+        </w:tabs>
+        <w:ind w:left="5760" w:hanging="360"/>
+      </w:pPr>
+    </w:lvl>
+    <w:lvl w:ilvl="8" w:tentative="1">
+      <w:start w:val="1"/>
+      <w:numFmt w:val="decimal"/>
+      <w:lvlText w:val="%9."/>
+      <w:lvlJc w:val="left"/>
+      <w:pPr>
+        <w:tabs>
+          <w:tab w:val="num" w:pos="6480"/>
+        </w:tabs>
+        <w:ind w:left="6480" w:hanging="360"/>
+      </w:pPr>
+    </w:lvl>
+  </w:abstractNum>
+  <w:abstractNum w:abstractNumId="5" w15:restartNumberingAfterBreak="0">
     <w:nsid w:val="573E3746"/>
     <w:multiLevelType w:val="hybridMultilevel"/>
     <w:tmpl w:val="4888E85C"/>
@@ -1435,23 +3019,301 @@
       </w:rPr>
     </w:lvl>
   </w:abstractNum>
-  <w:num w:numId="1">
+  <w:abstractNum w:abstractNumId="6" w15:restartNumberingAfterBreak="0">
+    <w:nsid w:val="751451C7"/>
+    <w:multiLevelType w:val="multilevel"/>
+    <w:tmpl w:val="2B781C92"/>
+    <w:lvl w:ilvl="0">
+      <w:start w:val="1"/>
+      <w:numFmt w:val="decimal"/>
+      <w:lvlText w:val="%1."/>
+      <w:lvlJc w:val="left"/>
+      <w:pPr>
+        <w:tabs>
+          <w:tab w:val="num" w:pos="720"/>
+        </w:tabs>
+        <w:ind w:left="720" w:hanging="360"/>
+      </w:pPr>
+    </w:lvl>
+    <w:lvl w:ilvl="1">
+      <w:start w:val="1"/>
+      <w:numFmt w:val="bullet"/>
+      <w:lvlText w:val="o"/>
+      <w:lvlJc w:val="left"/>
+      <w:pPr>
+        <w:tabs>
+          <w:tab w:val="num" w:pos="1440"/>
+        </w:tabs>
+        <w:ind w:left="1440" w:hanging="360"/>
+      </w:pPr>
+      <w:rPr>
+        <w:rFonts w:ascii="Courier New" w:hAnsi="Courier New" w:hint="default"/>
+        <w:sz w:val="20"/>
+      </w:rPr>
+    </w:lvl>
+    <w:lvl w:ilvl="2" w:tentative="1">
+      <w:start w:val="1"/>
+      <w:numFmt w:val="decimal"/>
+      <w:lvlText w:val="%3."/>
+      <w:lvlJc w:val="left"/>
+      <w:pPr>
+        <w:tabs>
+          <w:tab w:val="num" w:pos="2160"/>
+        </w:tabs>
+        <w:ind w:left="2160" w:hanging="360"/>
+      </w:pPr>
+    </w:lvl>
+    <w:lvl w:ilvl="3" w:tentative="1">
+      <w:start w:val="1"/>
+      <w:numFmt w:val="decimal"/>
+      <w:lvlText w:val="%4."/>
+      <w:lvlJc w:val="left"/>
+      <w:pPr>
+        <w:tabs>
+          <w:tab w:val="num" w:pos="2880"/>
+        </w:tabs>
+        <w:ind w:left="2880" w:hanging="360"/>
+      </w:pPr>
+    </w:lvl>
+    <w:lvl w:ilvl="4" w:tentative="1">
+      <w:start w:val="1"/>
+      <w:numFmt w:val="decimal"/>
+      <w:lvlText w:val="%5."/>
+      <w:lvlJc w:val="left"/>
+      <w:pPr>
+        <w:tabs>
+          <w:tab w:val="num" w:pos="3600"/>
+        </w:tabs>
+        <w:ind w:left="3600" w:hanging="360"/>
+      </w:pPr>
+    </w:lvl>
+    <w:lvl w:ilvl="5" w:tentative="1">
+      <w:start w:val="1"/>
+      <w:numFmt w:val="decimal"/>
+      <w:lvlText w:val="%6."/>
+      <w:lvlJc w:val="left"/>
+      <w:pPr>
+        <w:tabs>
+          <w:tab w:val="num" w:pos="4320"/>
+        </w:tabs>
+        <w:ind w:left="4320" w:hanging="360"/>
+      </w:pPr>
+    </w:lvl>
+    <w:lvl w:ilvl="6" w:tentative="1">
+      <w:start w:val="1"/>
+      <w:numFmt w:val="decimal"/>
+      <w:lvlText w:val="%7."/>
+      <w:lvlJc w:val="left"/>
+      <w:pPr>
+        <w:tabs>
+          <w:tab w:val="num" w:pos="5040"/>
+        </w:tabs>
+        <w:ind w:left="5040" w:hanging="360"/>
+      </w:pPr>
+    </w:lvl>
+    <w:lvl w:ilvl="7" w:tentative="1">
+      <w:start w:val="1"/>
+      <w:numFmt w:val="decimal"/>
+      <w:lvlText w:val="%8."/>
+      <w:lvlJc w:val="left"/>
+      <w:pPr>
+        <w:tabs>
+          <w:tab w:val="num" w:pos="5760"/>
+        </w:tabs>
+        <w:ind w:left="5760" w:hanging="360"/>
+      </w:pPr>
+    </w:lvl>
+    <w:lvl w:ilvl="8" w:tentative="1">
+      <w:start w:val="1"/>
+      <w:numFmt w:val="decimal"/>
+      <w:lvlText w:val="%9."/>
+      <w:lvlJc w:val="left"/>
+      <w:pPr>
+        <w:tabs>
+          <w:tab w:val="num" w:pos="6480"/>
+        </w:tabs>
+        <w:ind w:left="6480" w:hanging="360"/>
+      </w:pPr>
+    </w:lvl>
+  </w:abstractNum>
+  <w:abstractNum w:abstractNumId="7" w15:restartNumberingAfterBreak="0">
+    <w:nsid w:val="7D673453"/>
+    <w:multiLevelType w:val="multilevel"/>
+    <w:tmpl w:val="3FAACA7A"/>
+    <w:lvl w:ilvl="0">
+      <w:start w:val="1"/>
+      <w:numFmt w:val="bullet"/>
+      <w:lvlText w:val=""/>
+      <w:lvlJc w:val="left"/>
+      <w:pPr>
+        <w:tabs>
+          <w:tab w:val="num" w:pos="720"/>
+        </w:tabs>
+        <w:ind w:left="720" w:hanging="360"/>
+      </w:pPr>
+      <w:rPr>
+        <w:rFonts w:ascii="Symbol" w:hAnsi="Symbol" w:hint="default"/>
+        <w:sz w:val="20"/>
+      </w:rPr>
+    </w:lvl>
+    <w:lvl w:ilvl="1" w:tentative="1">
+      <w:start w:val="1"/>
+      <w:numFmt w:val="bullet"/>
+      <w:lvlText w:val="o"/>
+      <w:lvlJc w:val="left"/>
+      <w:pPr>
+        <w:tabs>
+          <w:tab w:val="num" w:pos="1440"/>
+        </w:tabs>
+        <w:ind w:left="1440" w:hanging="360"/>
+      </w:pPr>
+      <w:rPr>
+        <w:rFonts w:ascii="Courier New" w:hAnsi="Courier New" w:hint="default"/>
+        <w:sz w:val="20"/>
+      </w:rPr>
+    </w:lvl>
+    <w:lvl w:ilvl="2" w:tentative="1">
+      <w:start w:val="1"/>
+      <w:numFmt w:val="bullet"/>
+      <w:lvlText w:val=""/>
+      <w:lvlJc w:val="left"/>
+      <w:pPr>
+        <w:tabs>
+          <w:tab w:val="num" w:pos="2160"/>
+        </w:tabs>
+        <w:ind w:left="2160" w:hanging="360"/>
+      </w:pPr>
+      <w:rPr>
+        <w:rFonts w:ascii="Wingdings" w:hAnsi="Wingdings" w:hint="default"/>
+        <w:sz w:val="20"/>
+      </w:rPr>
+    </w:lvl>
+    <w:lvl w:ilvl="3" w:tentative="1">
+      <w:start w:val="1"/>
+      <w:numFmt w:val="bullet"/>
+      <w:lvlText w:val=""/>
+      <w:lvlJc w:val="left"/>
+      <w:pPr>
+        <w:tabs>
+          <w:tab w:val="num" w:pos="2880"/>
+        </w:tabs>
+        <w:ind w:left="2880" w:hanging="360"/>
+      </w:pPr>
+      <w:rPr>
+        <w:rFonts w:ascii="Wingdings" w:hAnsi="Wingdings" w:hint="default"/>
+        <w:sz w:val="20"/>
+      </w:rPr>
+    </w:lvl>
+    <w:lvl w:ilvl="4" w:tentative="1">
+      <w:start w:val="1"/>
+      <w:numFmt w:val="bullet"/>
+      <w:lvlText w:val=""/>
+      <w:lvlJc w:val="left"/>
+      <w:pPr>
+        <w:tabs>
+          <w:tab w:val="num" w:pos="3600"/>
+        </w:tabs>
+        <w:ind w:left="3600" w:hanging="360"/>
+      </w:pPr>
+      <w:rPr>
+        <w:rFonts w:ascii="Wingdings" w:hAnsi="Wingdings" w:hint="default"/>
+        <w:sz w:val="20"/>
+      </w:rPr>
+    </w:lvl>
+    <w:lvl w:ilvl="5" w:tentative="1">
+      <w:start w:val="1"/>
+      <w:numFmt w:val="bullet"/>
+      <w:lvlText w:val=""/>
+      <w:lvlJc w:val="left"/>
+      <w:pPr>
+        <w:tabs>
+          <w:tab w:val="num" w:pos="4320"/>
+        </w:tabs>
+        <w:ind w:left="4320" w:hanging="360"/>
+      </w:pPr>
+      <w:rPr>
+        <w:rFonts w:ascii="Wingdings" w:hAnsi="Wingdings" w:hint="default"/>
+        <w:sz w:val="20"/>
+      </w:rPr>
+    </w:lvl>
+    <w:lvl w:ilvl="6" w:tentative="1">
+      <w:start w:val="1"/>
+      <w:numFmt w:val="bullet"/>
+      <w:lvlText w:val=""/>
+      <w:lvlJc w:val="left"/>
+      <w:pPr>
+        <w:tabs>
+          <w:tab w:val="num" w:pos="5040"/>
+        </w:tabs>
+        <w:ind w:left="5040" w:hanging="360"/>
+      </w:pPr>
+      <w:rPr>
+        <w:rFonts w:ascii="Wingdings" w:hAnsi="Wingdings" w:hint="default"/>
+        <w:sz w:val="20"/>
+      </w:rPr>
+    </w:lvl>
+    <w:lvl w:ilvl="7" w:tentative="1">
+      <w:start w:val="1"/>
+      <w:numFmt w:val="bullet"/>
+      <w:lvlText w:val=""/>
+      <w:lvlJc w:val="left"/>
+      <w:pPr>
+        <w:tabs>
+          <w:tab w:val="num" w:pos="5760"/>
+        </w:tabs>
+        <w:ind w:left="5760" w:hanging="360"/>
+      </w:pPr>
+      <w:rPr>
+        <w:rFonts w:ascii="Wingdings" w:hAnsi="Wingdings" w:hint="default"/>
+        <w:sz w:val="20"/>
+      </w:rPr>
+    </w:lvl>
+    <w:lvl w:ilvl="8" w:tentative="1">
+      <w:start w:val="1"/>
+      <w:numFmt w:val="bullet"/>
+      <w:lvlText w:val=""/>
+      <w:lvlJc w:val="left"/>
+      <w:pPr>
+        <w:tabs>
+          <w:tab w:val="num" w:pos="6480"/>
+        </w:tabs>
+        <w:ind w:left="6480" w:hanging="360"/>
+      </w:pPr>
+      <w:rPr>
+        <w:rFonts w:ascii="Wingdings" w:hAnsi="Wingdings" w:hint="default"/>
+        <w:sz w:val="20"/>
+      </w:rPr>
+    </w:lvl>
+  </w:abstractNum>
+  <w:num w:numId="1" w16cid:durableId="1574579224">
+    <w:abstractNumId w:val="1"/>
+  </w:num>
+  <w:num w:numId="2" w16cid:durableId="1805925340">
+    <w:abstractNumId w:val="5"/>
+  </w:num>
+  <w:num w:numId="3" w16cid:durableId="1103763434">
+    <w:abstractNumId w:val="2"/>
+  </w:num>
+  <w:num w:numId="4" w16cid:durableId="591473867">
+    <w:abstractNumId w:val="3"/>
+  </w:num>
+  <w:num w:numId="5" w16cid:durableId="1125153029">
+    <w:abstractNumId w:val="6"/>
+  </w:num>
+  <w:num w:numId="6" w16cid:durableId="343868352">
+    <w:abstractNumId w:val="7"/>
+  </w:num>
+  <w:num w:numId="7" w16cid:durableId="499976140">
     <w:abstractNumId w:val="0"/>
   </w:num>
-  <w:num w:numId="2">
-    <w:abstractNumId w:val="3"/>
-  </w:num>
-  <w:num w:numId="3">
-    <w:abstractNumId w:val="1"/>
-  </w:num>
-  <w:num w:numId="4">
-    <w:abstractNumId w:val="2"/>
+  <w:num w:numId="8" w16cid:durableId="2078622539">
+    <w:abstractNumId w:val="4"/>
   </w:num>
 </w:numbering>
 </file>
 
 <file path=word/styles.xml><?xml version="1.0" encoding="utf-8"?>
-<w:styles xmlns:mc="http://schemas.openxmlformats.org/markup-compatibility/2006" xmlns:r="http://schemas.openxmlformats.org/officeDocument/2006/relationships" xmlns:w="http://schemas.openxmlformats.org/wordprocessingml/2006/main" xmlns:w14="http://schemas.microsoft.com/office/word/2010/wordml" xmlns:w15="http://schemas.microsoft.com/office/word/2012/wordml" xmlns:w16cex="http://schemas.microsoft.com/office/word/2018/wordml/cex" xmlns:w16cid="http://schemas.microsoft.com/office/word/2016/wordml/cid" xmlns:w16="http://schemas.microsoft.com/office/word/2018/wordml" xmlns:w16sdtdh="http://schemas.microsoft.com/office/word/2020/wordml/sdtdatahash" xmlns:w16se="http://schemas.microsoft.com/office/word/2015/wordml/symex" mc:Ignorable="w14 w15 w16se w16cid w16 w16cex w16sdtdh">
+<w:styles xmlns:mc="http://schemas.openxmlformats.org/markup-compatibility/2006" xmlns:r="http://schemas.openxmlformats.org/officeDocument/2006/relationships" xmlns:w="http://schemas.openxmlformats.org/wordprocessingml/2006/main" xmlns:w14="http://schemas.microsoft.com/office/word/2010/wordml" xmlns:w15="http://schemas.microsoft.com/office/word/2012/wordml" xmlns:w16cex="http://schemas.microsoft.com/office/word/2018/wordml/cex" xmlns:w16cid="http://schemas.microsoft.com/office/word/2016/wordml/cid" xmlns:w16="http://schemas.microsoft.com/office/word/2018/wordml" xmlns:w16du="http://schemas.microsoft.com/office/word/2023/wordml/word16du" xmlns:w16sdtdh="http://schemas.microsoft.com/office/word/2020/wordml/sdtdatahash" xmlns:w16sdtfl="http://schemas.microsoft.com/office/word/2024/wordml/sdtformatlock" xmlns:w16se="http://schemas.microsoft.com/office/word/2015/wordml/symex" mc:Ignorable="w14 w15 w16se w16cid w16 w16cex w16sdtdh w16sdtfl w16du">
   <w:docDefaults>
     <w:rPrDefault>
       <w:rPr>

</xml_diff>